<commit_message>
Update deal document templates to use standardized placeholders
Introduce a script to process .docx templates, converting various placeholder syntaxes (parentheses, brackets) to a consistent {{tag}} format for easier data population in deal documents.

Replit-Commit-Author: Agent
Replit-Commit-Session-Id: 7bf5aeac-9bdf-4497-ad87-f1a2119826a0
Replit-Commit-Checkpoint-Type: full_checkpoint
Replit-Commit-Event-Id: 27c6c18b-38fe-42cc-be4a-a823ae66cbce
Replit-Commit-Screenshot-Url: https://storage.googleapis.com/screenshot-production-us-central1/6e57f44f-baf8-42e1-87c9-1798c284d2de/7bf5aeac-9bdf-4497-ad87-f1a2119826a0/QIN4j1W
</commit_message>
<xml_diff>
--- a/data/templates/system_heads_of_terms.docx
+++ b/data/templates/system_heads_of_terms.docx
@@ -173,13 +173,7 @@
           <w:highlight w:val="yellow"/>
           <w:rtl w:val="0"/>
         </w:rPr>
-        <w:t xml:space="preserve">Date</w:t>
-      </w:r>
-      <w:r>
-        <w:rPr>
-          <w:rtl w:val="0"/>
-        </w:rPr>
-        <w:t xml:space="preserve"> </w:t>
+        <w:t xml:space="preserve">Date </w:t>
       </w:r>
       <w:r>
         <w:rPr>
@@ -294,8 +288,143 @@
           <w:vertAlign w:val="baseline"/>
           <w:rtl w:val="0"/>
         </w:rPr>
-        <w:t xml:space="preserve">PROPOSED ACQUISITION OF THE ENTIRE ISSUED SHARE CAPITAL OF</w:t>
-      </w:r>
+        <w:t xml:space="preserve">PROPOSED ACQUISITION OF THE ENTIRE ISSUED SHARE CAPITAL OF {{sellerCompanyName}} </w:t>
+      </w:r>
+      <w:r>
+        <w:rPr>
+          <w:rtl w:val="0"/>
+        </w:rPr>
+      </w:r>
+    </w:p>
+    <w:p>
+      <w:pPr>
+        <w:keepNext w:val="0"/>
+        <w:keepLines w:val="0"/>
+        <w:pageBreakBefore w:val="0"/>
+        <w:widowControl w:val="1"/>
+        <w:numPr>
+          <w:ilvl w:val="0"/>
+          <w:numId w:val="2"/>
+        </w:numPr>
+        <w:pBdr>
+          <w:top w:space="0" w:sz="0" w:val="nil"/>
+          <w:left w:space="0" w:sz="0" w:val="nil"/>
+          <w:bottom w:space="0" w:sz="0" w:val="nil"/>
+          <w:right w:space="0" w:sz="0" w:val="nil"/>
+          <w:between w:space="0" w:sz="0" w:val="nil"/>
+        </w:pBdr>
+        <w:shd w:fill="auto" w:val="clear"/>
+        <w:spacing w:after="240" w:before="0" w:line="300" w:lineRule="auto"/>
+        <w:ind w:left="0" w:right="0" w:firstLine="0"/>
+        <w:jc w:val="both"/>
+        <w:rPr>
+          <w:rFonts w:ascii="Arial" w:cs="Arial" w:eastAsia="Arial" w:hAnsi="Arial"/>
+          <w:b w:val="0"/>
+          <w:i w:val="0"/>
+          <w:smallCaps w:val="0"/>
+          <w:strike w:val="0"/>
+          <w:color w:val="000000"/>
+          <w:sz w:val="20"/>
+          <w:szCs w:val="20"/>
+          <w:u w:val="none"/>
+          <w:shd w:fill="auto" w:val="clear"/>
+          <w:vertAlign w:val="baseline"/>
+        </w:rPr>
+      </w:pPr>
+      <w:r>
+        <w:rPr>
+          <w:rFonts w:ascii="Arial" w:cs="Arial" w:eastAsia="Arial" w:hAnsi="Arial"/>
+          <w:b w:val="0"/>
+          <w:i w:val="0"/>
+          <w:smallCaps w:val="0"/>
+          <w:strike w:val="0"/>
+          <w:color w:val="000000"/>
+          <w:sz w:val="20"/>
+          <w:szCs w:val="20"/>
+          <w:u w:val="none"/>
+          <w:shd w:fill="auto" w:val="clear"/>
+          <w:vertAlign w:val="baseline"/>
+          <w:rtl w:val="0"/>
+        </w:rPr>
+        <w:t xml:space="preserve">Further to our recent discussions, this letter sets out the principal terms and conditions upon and subject to which {{buyerCompanyName}} or another nominated entity (the Buyer) is willing, in principle, to acquire the entire issued share capital (the Shares) of {{sellerCompanyName}} (the Company) from {{sellerContactName}} (the Sellers (as defined in paragraph 1.2)] (the Proposed Acquisition). </w:t>
+      </w:r>
+    </w:p>
+    <w:p>
+      <w:pPr>
+        <w:keepNext w:val="0"/>
+        <w:keepLines w:val="0"/>
+        <w:pageBreakBefore w:val="0"/>
+        <w:widowControl w:val="1"/>
+        <w:numPr>
+          <w:ilvl w:val="0"/>
+          <w:numId w:val="2"/>
+        </w:numPr>
+        <w:pBdr>
+          <w:top w:space="0" w:sz="0" w:val="nil"/>
+          <w:left w:space="0" w:sz="0" w:val="nil"/>
+          <w:bottom w:space="0" w:sz="0" w:val="nil"/>
+          <w:right w:space="0" w:sz="0" w:val="nil"/>
+          <w:between w:space="0" w:sz="0" w:val="nil"/>
+        </w:pBdr>
+        <w:shd w:fill="auto" w:val="clear"/>
+        <w:spacing w:after="240" w:before="0" w:line="300" w:lineRule="auto"/>
+        <w:ind w:left="0" w:right="0" w:firstLine="0"/>
+        <w:jc w:val="both"/>
+        <w:rPr>
+          <w:rFonts w:ascii="Arial" w:cs="Arial" w:eastAsia="Arial" w:hAnsi="Arial"/>
+          <w:b w:val="0"/>
+          <w:i w:val="0"/>
+          <w:smallCaps w:val="0"/>
+          <w:strike w:val="0"/>
+          <w:color w:val="000000"/>
+          <w:sz w:val="20"/>
+          <w:szCs w:val="20"/>
+          <w:u w:val="none"/>
+          <w:shd w:fill="auto" w:val="clear"/>
+          <w:vertAlign w:val="baseline"/>
+        </w:rPr>
+      </w:pPr>
+      <w:r>
+        <w:rPr>
+          <w:rFonts w:ascii="Arial" w:cs="Arial" w:eastAsia="Arial" w:hAnsi="Arial"/>
+          <w:b w:val="0"/>
+          <w:i w:val="0"/>
+          <w:smallCaps w:val="0"/>
+          <w:strike w:val="0"/>
+          <w:color w:val="000000"/>
+          <w:sz w:val="20"/>
+          <w:szCs w:val="20"/>
+          <w:u w:val="none"/>
+          <w:shd w:fill="auto" w:val="clear"/>
+          <w:vertAlign w:val="baseline"/>
+          <w:rtl w:val="0"/>
+        </w:rPr>
+        <w:t xml:space="preserve">The heads of terms set out in this letter are not exhaustive, are subject to contract and (with the exception of paragraphs 9 to 13) are not intended to be legally binding on the Buyer and the Sellers. Neither the Sellers nor the Buyer shall be legally bound to proceed with the Proposed Acquisition unless and until a legally binding share purchase agreement is entered into between them.</w:t>
+      </w:r>
+    </w:p>
+    <w:p>
+      <w:pPr>
+        <w:keepNext w:val="1"/>
+        <w:keepLines w:val="0"/>
+        <w:pageBreakBefore w:val="0"/>
+        <w:widowControl w:val="1"/>
+        <w:numPr>
+          <w:ilvl w:val="0"/>
+          <w:numId w:val="1"/>
+        </w:numPr>
+        <w:pBdr>
+          <w:top w:space="0" w:sz="0" w:val="nil"/>
+          <w:left w:space="0" w:sz="0" w:val="nil"/>
+          <w:bottom w:space="0" w:sz="0" w:val="nil"/>
+          <w:right w:space="0" w:sz="0" w:val="nil"/>
+          <w:between w:space="0" w:sz="0" w:val="nil"/>
+        </w:pBdr>
+        <w:shd w:fill="auto" w:val="clear"/>
+        <w:spacing w:after="240" w:before="0" w:line="300" w:lineRule="auto"/>
+        <w:ind w:left="851" w:right="0" w:hanging="851"/>
+        <w:jc w:val="left"/>
+        <w:rPr/>
+      </w:pPr>
       <w:r>
         <w:rPr>
           <w:rFonts w:ascii="Arial Bold" w:cs="Arial Bold" w:eastAsia="Arial Bold" w:hAnsi="Arial Bold"/>
@@ -306,461 +435,6 @@
           <w:color w:val="000000"/>
           <w:sz w:val="20"/>
           <w:szCs w:val="20"/>
-          <w:highlight w:val="yellow"/>
-          <w:u w:val="none"/>
-          <w:vertAlign w:val="baseline"/>
-          <w:rtl w:val="0"/>
-        </w:rPr>
-        <w:t xml:space="preserve"> </w:t>
-      </w:r>
-      <w:r>
-        <w:rPr>
-          <w:rFonts w:ascii="Arial Bold" w:cs="Arial Bold" w:eastAsia="Arial Bold" w:hAnsi="Arial Bold"/>
-          <w:b w:val="1"/>
-          <w:smallCaps w:val="1"/>
-          <w:highlight w:val="yellow"/>
-          <w:rtl w:val="0"/>
-        </w:rPr>
-        <w:t xml:space="preserve">[THEIR COMPANY NAME] </w:t>
-      </w:r>
-      <w:r>
-        <w:rPr>
-          <w:rtl w:val="0"/>
-        </w:rPr>
-      </w:r>
-    </w:p>
-    <w:p>
-      <w:pPr>
-        <w:keepNext w:val="0"/>
-        <w:keepLines w:val="0"/>
-        <w:pageBreakBefore w:val="0"/>
-        <w:widowControl w:val="1"/>
-        <w:numPr>
-          <w:ilvl w:val="0"/>
-          <w:numId w:val="2"/>
-        </w:numPr>
-        <w:pBdr>
-          <w:top w:space="0" w:sz="0" w:val="nil"/>
-          <w:left w:space="0" w:sz="0" w:val="nil"/>
-          <w:bottom w:space="0" w:sz="0" w:val="nil"/>
-          <w:right w:space="0" w:sz="0" w:val="nil"/>
-          <w:between w:space="0" w:sz="0" w:val="nil"/>
-        </w:pBdr>
-        <w:shd w:fill="auto" w:val="clear"/>
-        <w:spacing w:after="240" w:before="0" w:line="300" w:lineRule="auto"/>
-        <w:ind w:left="0" w:right="0" w:firstLine="0"/>
-        <w:jc w:val="both"/>
-        <w:rPr>
-          <w:rFonts w:ascii="Arial" w:cs="Arial" w:eastAsia="Arial" w:hAnsi="Arial"/>
-          <w:b w:val="0"/>
-          <w:i w:val="0"/>
-          <w:smallCaps w:val="0"/>
-          <w:strike w:val="0"/>
-          <w:color w:val="000000"/>
-          <w:sz w:val="20"/>
-          <w:szCs w:val="20"/>
-          <w:u w:val="none"/>
-          <w:shd w:fill="auto" w:val="clear"/>
-          <w:vertAlign w:val="baseline"/>
-        </w:rPr>
-      </w:pPr>
-      <w:r>
-        <w:rPr>
-          <w:rFonts w:ascii="Arial" w:cs="Arial" w:eastAsia="Arial" w:hAnsi="Arial"/>
-          <w:b w:val="0"/>
-          <w:i w:val="0"/>
-          <w:smallCaps w:val="0"/>
-          <w:strike w:val="0"/>
-          <w:color w:val="000000"/>
-          <w:sz w:val="20"/>
-          <w:szCs w:val="20"/>
-          <w:u w:val="none"/>
-          <w:shd w:fill="auto" w:val="clear"/>
-          <w:vertAlign w:val="baseline"/>
-          <w:rtl w:val="0"/>
-        </w:rPr>
-        <w:t xml:space="preserve">Further to our recent discussions, this letter sets out the principal terms and conditions upon and subject to which </w:t>
-      </w:r>
-      <w:r>
-        <w:rPr>
-          <w:highlight w:val="yellow"/>
-          <w:rtl w:val="0"/>
-        </w:rPr>
-        <w:t xml:space="preserve">[Your Company Name]</w:t>
-      </w:r>
-      <w:r>
-        <w:rPr>
-          <w:rFonts w:ascii="Arial" w:cs="Arial" w:eastAsia="Arial" w:hAnsi="Arial"/>
-          <w:b w:val="0"/>
-          <w:i w:val="0"/>
-          <w:smallCaps w:val="0"/>
-          <w:strike w:val="0"/>
-          <w:color w:val="000000"/>
-          <w:sz w:val="20"/>
-          <w:szCs w:val="20"/>
-          <w:u w:val="none"/>
-          <w:shd w:fill="auto" w:val="clear"/>
-          <w:vertAlign w:val="baseline"/>
-          <w:rtl w:val="0"/>
-        </w:rPr>
-        <w:t xml:space="preserve"> or another nominated entity (the </w:t>
-      </w:r>
-      <w:r>
-        <w:rPr>
-          <w:rFonts w:ascii="Arial" w:cs="Arial" w:eastAsia="Arial" w:hAnsi="Arial"/>
-          <w:b w:val="1"/>
-          <w:i w:val="0"/>
-          <w:smallCaps w:val="0"/>
-          <w:strike w:val="0"/>
-          <w:color w:val="000000"/>
-          <w:sz w:val="20"/>
-          <w:szCs w:val="20"/>
-          <w:u w:val="none"/>
-          <w:shd w:fill="auto" w:val="clear"/>
-          <w:vertAlign w:val="baseline"/>
-          <w:rtl w:val="0"/>
-        </w:rPr>
-        <w:t xml:space="preserve">Buyer</w:t>
-      </w:r>
-      <w:r>
-        <w:rPr>
-          <w:rFonts w:ascii="Arial" w:cs="Arial" w:eastAsia="Arial" w:hAnsi="Arial"/>
-          <w:b w:val="0"/>
-          <w:i w:val="0"/>
-          <w:smallCaps w:val="0"/>
-          <w:strike w:val="0"/>
-          <w:color w:val="000000"/>
-          <w:sz w:val="20"/>
-          <w:szCs w:val="20"/>
-          <w:u w:val="none"/>
-          <w:shd w:fill="auto" w:val="clear"/>
-          <w:vertAlign w:val="baseline"/>
-          <w:rtl w:val="0"/>
-        </w:rPr>
-        <w:t xml:space="preserve">) is willing, in principle, to acquire the entire issued share capital (the </w:t>
-      </w:r>
-      <w:r>
-        <w:rPr>
-          <w:rFonts w:ascii="Arial" w:cs="Arial" w:eastAsia="Arial" w:hAnsi="Arial"/>
-          <w:b w:val="1"/>
-          <w:i w:val="0"/>
-          <w:smallCaps w:val="0"/>
-          <w:strike w:val="0"/>
-          <w:color w:val="000000"/>
-          <w:sz w:val="20"/>
-          <w:szCs w:val="20"/>
-          <w:u w:val="none"/>
-          <w:shd w:fill="auto" w:val="clear"/>
-          <w:vertAlign w:val="baseline"/>
-          <w:rtl w:val="0"/>
-        </w:rPr>
-        <w:t xml:space="preserve">Shares</w:t>
-      </w:r>
-      <w:r>
-        <w:rPr>
-          <w:rFonts w:ascii="Arial" w:cs="Arial" w:eastAsia="Arial" w:hAnsi="Arial"/>
-          <w:b w:val="0"/>
-          <w:i w:val="0"/>
-          <w:smallCaps w:val="0"/>
-          <w:strike w:val="0"/>
-          <w:color w:val="000000"/>
-          <w:sz w:val="20"/>
-          <w:szCs w:val="20"/>
-          <w:u w:val="none"/>
-          <w:shd w:fill="auto" w:val="clear"/>
-          <w:vertAlign w:val="baseline"/>
-          <w:rtl w:val="0"/>
-        </w:rPr>
-        <w:t xml:space="preserve">) of</w:t>
-      </w:r>
-      <w:r>
-        <w:rPr>
-          <w:rFonts w:ascii="Arial" w:cs="Arial" w:eastAsia="Arial" w:hAnsi="Arial"/>
-          <w:b w:val="0"/>
-          <w:i w:val="0"/>
-          <w:smallCaps w:val="0"/>
-          <w:strike w:val="0"/>
-          <w:color w:val="000000"/>
-          <w:sz w:val="20"/>
-          <w:szCs w:val="20"/>
-          <w:highlight w:val="yellow"/>
-          <w:u w:val="none"/>
-          <w:vertAlign w:val="baseline"/>
-          <w:rtl w:val="0"/>
-        </w:rPr>
-        <w:t xml:space="preserve"> </w:t>
-      </w:r>
-      <w:r>
-        <w:rPr>
-          <w:highlight w:val="yellow"/>
-          <w:rtl w:val="0"/>
-        </w:rPr>
-        <w:t xml:space="preserve">[Their Company Name] </w:t>
-      </w:r>
-      <w:r>
-        <w:rPr>
-          <w:rFonts w:ascii="Arial" w:cs="Arial" w:eastAsia="Arial" w:hAnsi="Arial"/>
-          <w:b w:val="0"/>
-          <w:i w:val="0"/>
-          <w:smallCaps w:val="0"/>
-          <w:strike w:val="0"/>
-          <w:color w:val="000000"/>
-          <w:sz w:val="20"/>
-          <w:szCs w:val="20"/>
-          <w:u w:val="none"/>
-          <w:shd w:fill="auto" w:val="clear"/>
-          <w:vertAlign w:val="baseline"/>
-          <w:rtl w:val="0"/>
-        </w:rPr>
-        <w:t xml:space="preserve">(the </w:t>
-      </w:r>
-      <w:r>
-        <w:rPr>
-          <w:rFonts w:ascii="Arial" w:cs="Arial" w:eastAsia="Arial" w:hAnsi="Arial"/>
-          <w:b w:val="1"/>
-          <w:i w:val="0"/>
-          <w:smallCaps w:val="0"/>
-          <w:strike w:val="0"/>
-          <w:color w:val="000000"/>
-          <w:sz w:val="20"/>
-          <w:szCs w:val="20"/>
-          <w:u w:val="none"/>
-          <w:shd w:fill="auto" w:val="clear"/>
-          <w:vertAlign w:val="baseline"/>
-          <w:rtl w:val="0"/>
-        </w:rPr>
-        <w:t xml:space="preserve">Company</w:t>
-      </w:r>
-      <w:r>
-        <w:rPr>
-          <w:rFonts w:ascii="Arial" w:cs="Arial" w:eastAsia="Arial" w:hAnsi="Arial"/>
-          <w:b w:val="0"/>
-          <w:i w:val="0"/>
-          <w:smallCaps w:val="0"/>
-          <w:strike w:val="0"/>
-          <w:color w:val="000000"/>
-          <w:sz w:val="20"/>
-          <w:szCs w:val="20"/>
-          <w:u w:val="none"/>
-          <w:shd w:fill="auto" w:val="clear"/>
-          <w:vertAlign w:val="baseline"/>
-          <w:rtl w:val="0"/>
-        </w:rPr>
-        <w:t xml:space="preserve">)</w:t>
-      </w:r>
-      <w:r>
-        <w:rPr>
-          <w:rFonts w:ascii="Arial" w:cs="Arial" w:eastAsia="Arial" w:hAnsi="Arial"/>
-          <w:b w:val="1"/>
-          <w:i w:val="0"/>
-          <w:smallCaps w:val="0"/>
-          <w:strike w:val="0"/>
-          <w:color w:val="000000"/>
-          <w:sz w:val="20"/>
-          <w:szCs w:val="20"/>
-          <w:u w:val="none"/>
-          <w:shd w:fill="auto" w:val="clear"/>
-          <w:vertAlign w:val="baseline"/>
-          <w:rtl w:val="0"/>
-        </w:rPr>
-        <w:t xml:space="preserve"> </w:t>
-      </w:r>
-      <w:r>
-        <w:rPr>
-          <w:rFonts w:ascii="Arial" w:cs="Arial" w:eastAsia="Arial" w:hAnsi="Arial"/>
-          <w:b w:val="0"/>
-          <w:i w:val="0"/>
-          <w:smallCaps w:val="0"/>
-          <w:strike w:val="0"/>
-          <w:color w:val="000000"/>
-          <w:sz w:val="20"/>
-          <w:szCs w:val="20"/>
-          <w:u w:val="none"/>
-          <w:shd w:fill="auto" w:val="clear"/>
-          <w:vertAlign w:val="baseline"/>
-          <w:rtl w:val="0"/>
-        </w:rPr>
-        <w:t xml:space="preserve">from </w:t>
-      </w:r>
-      <w:r>
-        <w:rPr>
-          <w:highlight w:val="yellow"/>
-          <w:rtl w:val="0"/>
-        </w:rPr>
-        <w:t xml:space="preserve">[Their Company Directors]</w:t>
-      </w:r>
-      <w:r>
-        <w:rPr>
-          <w:rFonts w:ascii="Arial" w:cs="Arial" w:eastAsia="Arial" w:hAnsi="Arial"/>
-          <w:b w:val="0"/>
-          <w:i w:val="0"/>
-          <w:smallCaps w:val="0"/>
-          <w:strike w:val="0"/>
-          <w:color w:val="000000"/>
-          <w:sz w:val="20"/>
-          <w:szCs w:val="20"/>
-          <w:u w:val="none"/>
-          <w:shd w:fill="auto" w:val="clear"/>
-          <w:vertAlign w:val="baseline"/>
-          <w:rtl w:val="0"/>
-        </w:rPr>
-        <w:t xml:space="preserve"> (the </w:t>
-      </w:r>
-      <w:r>
-        <w:rPr>
-          <w:rFonts w:ascii="Arial" w:cs="Arial" w:eastAsia="Arial" w:hAnsi="Arial"/>
-          <w:b w:val="1"/>
-          <w:i w:val="0"/>
-          <w:smallCaps w:val="0"/>
-          <w:strike w:val="0"/>
-          <w:color w:val="000000"/>
-          <w:sz w:val="20"/>
-          <w:szCs w:val="20"/>
-          <w:u w:val="none"/>
-          <w:shd w:fill="auto" w:val="clear"/>
-          <w:vertAlign w:val="baseline"/>
-          <w:rtl w:val="0"/>
-        </w:rPr>
-        <w:t xml:space="preserve">Sellers</w:t>
-      </w:r>
-      <w:r>
-        <w:rPr>
-          <w:rFonts w:ascii="Arial" w:cs="Arial" w:eastAsia="Arial" w:hAnsi="Arial"/>
-          <w:b w:val="0"/>
-          <w:i w:val="0"/>
-          <w:smallCaps w:val="0"/>
-          <w:strike w:val="0"/>
-          <w:color w:val="000000"/>
-          <w:sz w:val="20"/>
-          <w:szCs w:val="20"/>
-          <w:u w:val="none"/>
-          <w:shd w:fill="auto" w:val="clear"/>
-          <w:vertAlign w:val="baseline"/>
-          <w:rtl w:val="0"/>
-        </w:rPr>
-        <w:t xml:space="preserve"> (as defined in paragraph 1.2)] (the </w:t>
-      </w:r>
-      <w:r>
-        <w:rPr>
-          <w:rFonts w:ascii="Arial" w:cs="Arial" w:eastAsia="Arial" w:hAnsi="Arial"/>
-          <w:b w:val="1"/>
-          <w:i w:val="0"/>
-          <w:smallCaps w:val="0"/>
-          <w:strike w:val="0"/>
-          <w:color w:val="000000"/>
-          <w:sz w:val="20"/>
-          <w:szCs w:val="20"/>
-          <w:u w:val="none"/>
-          <w:shd w:fill="auto" w:val="clear"/>
-          <w:vertAlign w:val="baseline"/>
-          <w:rtl w:val="0"/>
-        </w:rPr>
-        <w:t xml:space="preserve">Proposed Acquisition</w:t>
-      </w:r>
-      <w:r>
-        <w:rPr>
-          <w:rFonts w:ascii="Arial" w:cs="Arial" w:eastAsia="Arial" w:hAnsi="Arial"/>
-          <w:b w:val="0"/>
-          <w:i w:val="0"/>
-          <w:smallCaps w:val="0"/>
-          <w:strike w:val="0"/>
-          <w:color w:val="000000"/>
-          <w:sz w:val="20"/>
-          <w:szCs w:val="20"/>
-          <w:u w:val="none"/>
-          <w:shd w:fill="auto" w:val="clear"/>
-          <w:vertAlign w:val="baseline"/>
-          <w:rtl w:val="0"/>
-        </w:rPr>
-        <w:t xml:space="preserve">). </w:t>
-      </w:r>
-    </w:p>
-    <w:p>
-      <w:pPr>
-        <w:keepNext w:val="0"/>
-        <w:keepLines w:val="0"/>
-        <w:pageBreakBefore w:val="0"/>
-        <w:widowControl w:val="1"/>
-        <w:numPr>
-          <w:ilvl w:val="0"/>
-          <w:numId w:val="2"/>
-        </w:numPr>
-        <w:pBdr>
-          <w:top w:space="0" w:sz="0" w:val="nil"/>
-          <w:left w:space="0" w:sz="0" w:val="nil"/>
-          <w:bottom w:space="0" w:sz="0" w:val="nil"/>
-          <w:right w:space="0" w:sz="0" w:val="nil"/>
-          <w:between w:space="0" w:sz="0" w:val="nil"/>
-        </w:pBdr>
-        <w:shd w:fill="auto" w:val="clear"/>
-        <w:spacing w:after="240" w:before="0" w:line="300" w:lineRule="auto"/>
-        <w:ind w:left="0" w:right="0" w:firstLine="0"/>
-        <w:jc w:val="both"/>
-        <w:rPr>
-          <w:rFonts w:ascii="Arial" w:cs="Arial" w:eastAsia="Arial" w:hAnsi="Arial"/>
-          <w:b w:val="0"/>
-          <w:i w:val="0"/>
-          <w:smallCaps w:val="0"/>
-          <w:strike w:val="0"/>
-          <w:color w:val="000000"/>
-          <w:sz w:val="20"/>
-          <w:szCs w:val="20"/>
-          <w:u w:val="none"/>
-          <w:shd w:fill="auto" w:val="clear"/>
-          <w:vertAlign w:val="baseline"/>
-        </w:rPr>
-      </w:pPr>
-      <w:r>
-        <w:rPr>
-          <w:rFonts w:ascii="Arial" w:cs="Arial" w:eastAsia="Arial" w:hAnsi="Arial"/>
-          <w:b w:val="0"/>
-          <w:i w:val="0"/>
-          <w:smallCaps w:val="0"/>
-          <w:strike w:val="0"/>
-          <w:color w:val="000000"/>
-          <w:sz w:val="20"/>
-          <w:szCs w:val="20"/>
-          <w:u w:val="none"/>
-          <w:shd w:fill="auto" w:val="clear"/>
-          <w:vertAlign w:val="baseline"/>
-          <w:rtl w:val="0"/>
-        </w:rPr>
-        <w:t xml:space="preserve">The heads of terms set out in this letter are not exhaustive, are subject to contract and (with the exception of paragraphs 9 to 13) are not intended to be legally binding on the Buyer and the Sellers. Neither the Sellers nor the Buyer shall be legally bound to proceed with the Proposed Acquisition unless and until a legally binding share purchase agreement is entered into between them.</w:t>
-      </w:r>
-    </w:p>
-    <w:p>
-      <w:pPr>
-        <w:keepNext w:val="1"/>
-        <w:keepLines w:val="0"/>
-        <w:pageBreakBefore w:val="0"/>
-        <w:widowControl w:val="1"/>
-        <w:numPr>
-          <w:ilvl w:val="0"/>
-          <w:numId w:val="1"/>
-        </w:numPr>
-        <w:pBdr>
-          <w:top w:space="0" w:sz="0" w:val="nil"/>
-          <w:left w:space="0" w:sz="0" w:val="nil"/>
-          <w:bottom w:space="0" w:sz="0" w:val="nil"/>
-          <w:right w:space="0" w:sz="0" w:val="nil"/>
-          <w:between w:space="0" w:sz="0" w:val="nil"/>
-        </w:pBdr>
-        <w:shd w:fill="auto" w:val="clear"/>
-        <w:spacing w:after="240" w:before="0" w:line="300" w:lineRule="auto"/>
-        <w:ind w:left="851" w:right="0" w:hanging="851"/>
-        <w:jc w:val="left"/>
-        <w:rPr/>
-      </w:pPr>
-      <w:r>
-        <w:rPr>
-          <w:rFonts w:ascii="Arial Bold" w:cs="Arial Bold" w:eastAsia="Arial Bold" w:hAnsi="Arial Bold"/>
-          <w:b w:val="1"/>
-          <w:i w:val="0"/>
-          <w:smallCaps w:val="1"/>
-          <w:strike w:val="0"/>
-          <w:color w:val="000000"/>
-          <w:sz w:val="20"/>
-          <w:szCs w:val="20"/>
           <w:u w:val="none"/>
           <w:shd w:fill="auto" w:val="clear"/>
           <w:vertAlign w:val="baseline"/>
@@ -850,75 +524,7 @@
           <w:vertAlign w:val="baseline"/>
           <w:rtl w:val="0"/>
         </w:rPr>
-        <w:t xml:space="preserve">As at the date of this letter, the Shares are owned by the persons set out below (who, together with those individuals identified in paragraph 4.7 below shall be a </w:t>
-      </w:r>
-      <w:r>
-        <w:rPr>
-          <w:rFonts w:ascii="Arial" w:cs="Arial" w:eastAsia="Arial" w:hAnsi="Arial"/>
-          <w:b w:val="1"/>
-          <w:i w:val="0"/>
-          <w:smallCaps w:val="0"/>
-          <w:strike w:val="0"/>
-          <w:color w:val="000000"/>
-          <w:sz w:val="20"/>
-          <w:szCs w:val="20"/>
-          <w:u w:val="none"/>
-          <w:shd w:fill="auto" w:val="clear"/>
-          <w:vertAlign w:val="baseline"/>
-          <w:rtl w:val="0"/>
-        </w:rPr>
-        <w:t xml:space="preserve">Seller</w:t>
-      </w:r>
-      <w:r>
-        <w:rPr>
-          <w:rFonts w:ascii="Arial" w:cs="Arial" w:eastAsia="Arial" w:hAnsi="Arial"/>
-          <w:b w:val="0"/>
-          <w:i w:val="0"/>
-          <w:smallCaps w:val="0"/>
-          <w:strike w:val="0"/>
-          <w:color w:val="000000"/>
-          <w:sz w:val="20"/>
-          <w:szCs w:val="20"/>
-          <w:u w:val="none"/>
-          <w:shd w:fill="auto" w:val="clear"/>
-          <w:vertAlign w:val="baseline"/>
-          <w:rtl w:val="0"/>
-        </w:rPr>
-        <w:t xml:space="preserve">, together the </w:t>
-      </w:r>
-      <w:r>
-        <w:rPr>
-          <w:rFonts w:ascii="Arial" w:cs="Arial" w:eastAsia="Arial" w:hAnsi="Arial"/>
-          <w:b w:val="1"/>
-          <w:i w:val="0"/>
-          <w:smallCaps w:val="0"/>
-          <w:strike w:val="0"/>
-          <w:color w:val="000000"/>
-          <w:sz w:val="20"/>
-          <w:szCs w:val="20"/>
-          <w:u w:val="none"/>
-          <w:shd w:fill="auto" w:val="clear"/>
-          <w:vertAlign w:val="baseline"/>
-          <w:rtl w:val="0"/>
-        </w:rPr>
-        <w:t xml:space="preserve">Sellers</w:t>
-      </w:r>
-      <w:r>
-        <w:rPr>
-          <w:rFonts w:ascii="Arial" w:cs="Arial" w:eastAsia="Arial" w:hAnsi="Arial"/>
-          <w:b w:val="0"/>
-          <w:i w:val="0"/>
-          <w:smallCaps w:val="0"/>
-          <w:strike w:val="0"/>
-          <w:color w:val="000000"/>
-          <w:sz w:val="20"/>
-          <w:szCs w:val="20"/>
-          <w:u w:val="none"/>
-          <w:shd w:fill="auto" w:val="clear"/>
-          <w:vertAlign w:val="baseline"/>
-          <w:rtl w:val="0"/>
-        </w:rPr>
-        <w:t xml:space="preserve">) in the following proportions:</w:t>
+        <w:t xml:space="preserve">As at the date of this letter, the Shares are owned by the persons set out below (who, together with those individuals identified in paragraph 4.7 below shall be a Seller, together the Sellers) in the following proportions:</w:t>
       </w:r>
     </w:p>
     <w:tbl>
@@ -1191,24 +797,7 @@
               <w:rPr>
                 <w:rtl w:val="0"/>
               </w:rPr>
-              <w:t xml:space="preserve">eg </w:t>
-            </w:r>
-            <w:r>
-              <w:rPr>
-                <w:rFonts w:ascii="Arial" w:cs="Arial" w:eastAsia="Arial" w:hAnsi="Arial"/>
-                <w:b w:val="0"/>
-                <w:i w:val="0"/>
-                <w:smallCaps w:val="0"/>
-                <w:strike w:val="0"/>
-                <w:color w:val="000000"/>
-                <w:sz w:val="20"/>
-                <w:szCs w:val="20"/>
-                <w:u w:val="none"/>
-                <w:shd w:fill="auto" w:val="clear"/>
-                <w:vertAlign w:val="baseline"/>
-                <w:rtl w:val="0"/>
-              </w:rPr>
-              <w:t xml:space="preserve">190 ordinary shares of £1.00 each</w:t>
+              <w:t xml:space="preserve">eg 190 ordinary shares of £1.00 each</w:t>
             </w:r>
           </w:p>
         </w:tc>
@@ -1241,24 +830,7 @@
               <w:rPr>
                 <w:rtl w:val="0"/>
               </w:rPr>
-              <w:t xml:space="preserve">eg </w:t>
-            </w:r>
-            <w:r>
-              <w:rPr>
-                <w:rFonts w:ascii="Arial" w:cs="Arial" w:eastAsia="Arial" w:hAnsi="Arial"/>
-                <w:b w:val="0"/>
-                <w:i w:val="0"/>
-                <w:smallCaps w:val="0"/>
-                <w:strike w:val="0"/>
-                <w:color w:val="000000"/>
-                <w:sz w:val="20"/>
-                <w:szCs w:val="20"/>
-                <w:u w:val="none"/>
-                <w:shd w:fill="auto" w:val="clear"/>
-                <w:vertAlign w:val="baseline"/>
-                <w:rtl w:val="0"/>
-              </w:rPr>
-              <w:t xml:space="preserve">95%</w:t>
+              <w:t xml:space="preserve">eg 95%</w:t>
             </w:r>
           </w:p>
         </w:tc>
@@ -1338,24 +910,7 @@
               <w:rPr>
                 <w:rtl w:val="0"/>
               </w:rPr>
-              <w:t xml:space="preserve">eg </w:t>
-            </w:r>
-            <w:r>
-              <w:rPr>
-                <w:rFonts w:ascii="Arial" w:cs="Arial" w:eastAsia="Arial" w:hAnsi="Arial"/>
-                <w:b w:val="0"/>
-                <w:i w:val="0"/>
-                <w:smallCaps w:val="0"/>
-                <w:strike w:val="0"/>
-                <w:color w:val="000000"/>
-                <w:sz w:val="20"/>
-                <w:szCs w:val="20"/>
-                <w:u w:val="none"/>
-                <w:shd w:fill="auto" w:val="clear"/>
-                <w:vertAlign w:val="baseline"/>
-                <w:rtl w:val="0"/>
-              </w:rPr>
-              <w:t xml:space="preserve">10 ordinary shares of £1.00 each</w:t>
+              <w:t xml:space="preserve">eg 10 ordinary shares of £1.00 each</w:t>
             </w:r>
           </w:p>
         </w:tc>
@@ -1388,24 +943,7 @@
               <w:rPr>
                 <w:rtl w:val="0"/>
               </w:rPr>
-              <w:t xml:space="preserve">eg </w:t>
-            </w:r>
-            <w:r>
-              <w:rPr>
-                <w:rFonts w:ascii="Arial" w:cs="Arial" w:eastAsia="Arial" w:hAnsi="Arial"/>
-                <w:b w:val="0"/>
-                <w:i w:val="0"/>
-                <w:smallCaps w:val="0"/>
-                <w:strike w:val="0"/>
-                <w:color w:val="000000"/>
-                <w:sz w:val="20"/>
-                <w:szCs w:val="20"/>
-                <w:u w:val="none"/>
-                <w:shd w:fill="auto" w:val="clear"/>
-                <w:vertAlign w:val="baseline"/>
-                <w:rtl w:val="0"/>
-              </w:rPr>
-              <w:t xml:space="preserve">5%</w:t>
+              <w:t xml:space="preserve">eg 5%</w:t>
             </w:r>
           </w:p>
         </w:tc>
@@ -1543,106 +1081,7 @@
           <w:vertAlign w:val="baseline"/>
           <w:rtl w:val="0"/>
         </w:rPr>
-        <w:t xml:space="preserve">[Based on the Company's annual accounts as at </w:t>
-      </w:r>
-      <w:r>
-        <w:rPr>
-          <w:highlight w:val="yellow"/>
-          <w:rtl w:val="0"/>
-        </w:rPr>
-        <w:t xml:space="preserve">[DATE]</w:t>
-      </w:r>
-      <w:r>
-        <w:rPr>
-          <w:rFonts w:ascii="Arial" w:cs="Arial" w:eastAsia="Arial" w:hAnsi="Arial"/>
-          <w:b w:val="0"/>
-          <w:i w:val="0"/>
-          <w:smallCaps w:val="0"/>
-          <w:strike w:val="0"/>
-          <w:color w:val="000000"/>
-          <w:sz w:val="20"/>
-          <w:szCs w:val="20"/>
-          <w:u w:val="none"/>
-          <w:shd w:fill="auto" w:val="clear"/>
-          <w:vertAlign w:val="baseline"/>
-          <w:rtl w:val="0"/>
-        </w:rPr>
-        <w:t xml:space="preserve">, the price for the purchase of the Shares will be</w:t>
-      </w:r>
-      <w:r>
-        <w:rPr>
-          <w:rFonts w:ascii="Arial" w:cs="Arial" w:eastAsia="Arial" w:hAnsi="Arial"/>
-          <w:b w:val="0"/>
-          <w:i w:val="0"/>
-          <w:smallCaps w:val="0"/>
-          <w:strike w:val="0"/>
-          <w:color w:val="000000"/>
-          <w:sz w:val="20"/>
-          <w:szCs w:val="20"/>
-          <w:highlight w:val="yellow"/>
-          <w:u w:val="none"/>
-          <w:vertAlign w:val="baseline"/>
-          <w:rtl w:val="0"/>
-        </w:rPr>
-        <w:t xml:space="preserve"> </w:t>
-      </w:r>
-      <w:r>
-        <w:rPr>
-          <w:highlight w:val="yellow"/>
-          <w:rtl w:val="0"/>
-        </w:rPr>
-        <w:t xml:space="preserve">[£££]</w:t>
-      </w:r>
-      <w:r>
-        <w:rPr>
-          <w:rFonts w:ascii="Arial" w:cs="Arial" w:eastAsia="Arial" w:hAnsi="Arial"/>
-          <w:b w:val="0"/>
-          <w:i w:val="0"/>
-          <w:smallCaps w:val="0"/>
-          <w:strike w:val="0"/>
-          <w:color w:val="000000"/>
-          <w:sz w:val="20"/>
-          <w:szCs w:val="20"/>
-          <w:u w:val="none"/>
-          <w:shd w:fill="auto" w:val="clear"/>
-          <w:vertAlign w:val="baseline"/>
-          <w:rtl w:val="0"/>
-        </w:rPr>
-        <w:t xml:space="preserve"> (the </w:t>
-      </w:r>
-      <w:r>
-        <w:rPr>
-          <w:rFonts w:ascii="Arial" w:cs="Arial" w:eastAsia="Arial" w:hAnsi="Arial"/>
-          <w:b w:val="1"/>
-          <w:i w:val="0"/>
-          <w:smallCaps w:val="0"/>
-          <w:strike w:val="0"/>
-          <w:color w:val="000000"/>
-          <w:sz w:val="20"/>
-          <w:szCs w:val="20"/>
-          <w:u w:val="none"/>
-          <w:shd w:fill="auto" w:val="clear"/>
-          <w:vertAlign w:val="baseline"/>
-          <w:rtl w:val="0"/>
-        </w:rPr>
-        <w:t xml:space="preserve">Price</w:t>
-      </w:r>
-      <w:r>
-        <w:rPr>
-          <w:rFonts w:ascii="Arial" w:cs="Arial" w:eastAsia="Arial" w:hAnsi="Arial"/>
-          <w:b w:val="0"/>
-          <w:i w:val="0"/>
-          <w:smallCaps w:val="0"/>
-          <w:strike w:val="0"/>
-          <w:color w:val="000000"/>
-          <w:sz w:val="20"/>
-          <w:szCs w:val="20"/>
-          <w:u w:val="none"/>
-          <w:shd w:fill="auto" w:val="clear"/>
-          <w:vertAlign w:val="baseline"/>
-          <w:rtl w:val="0"/>
-        </w:rPr>
-        <w:t xml:space="preserve">).</w:t>
+        <w:t xml:space="preserve">[Based on the Company's annual accounts as at {{currentDate}}, the price for the purchase of the Shares will be {{offerPrice}} (the Price).</w:t>
       </w:r>
     </w:p>
     <w:p>
@@ -1683,65 +1122,7 @@
           <w:vertAlign w:val="baseline"/>
           <w:rtl w:val="0"/>
         </w:rPr>
-        <w:t xml:space="preserve">The Price is to be satisfied by the payment of </w:t>
-      </w:r>
-      <w:r>
-        <w:rPr>
-          <w:rFonts w:ascii="Arial" w:cs="Arial" w:eastAsia="Arial" w:hAnsi="Arial"/>
-          <w:b w:val="0"/>
-          <w:i w:val="0"/>
-          <w:smallCaps w:val="0"/>
-          <w:strike w:val="0"/>
-          <w:color w:val="000000"/>
-          <w:sz w:val="20"/>
-          <w:szCs w:val="20"/>
-          <w:highlight w:val="yellow"/>
-          <w:u w:val="none"/>
-          <w:vertAlign w:val="baseline"/>
-          <w:rtl w:val="0"/>
-        </w:rPr>
-        <w:t xml:space="preserve">£[TBC]</w:t>
-      </w:r>
-      <w:r>
-        <w:rPr>
-          <w:rFonts w:ascii="Arial" w:cs="Arial" w:eastAsia="Arial" w:hAnsi="Arial"/>
-          <w:b w:val="0"/>
-          <w:i w:val="0"/>
-          <w:smallCaps w:val="0"/>
-          <w:strike w:val="0"/>
-          <w:color w:val="000000"/>
-          <w:sz w:val="20"/>
-          <w:szCs w:val="20"/>
-          <w:u w:val="none"/>
-          <w:shd w:fill="auto" w:val="clear"/>
-          <w:vertAlign w:val="baseline"/>
-          <w:rtl w:val="0"/>
-        </w:rPr>
-        <w:t xml:space="preserve"> in cash on completion of the Proposed Acquisition and the remaining balance to be payable in equal monthly instalments over </w:t>
-      </w:r>
-      <w:r>
-        <w:rPr>
-          <w:highlight w:val="yellow"/>
-          <w:rtl w:val="0"/>
-        </w:rPr>
-        <w:t xml:space="preserve">X</w:t>
-      </w:r>
-      <w:r>
-        <w:rPr>
-          <w:rFonts w:ascii="Arial" w:cs="Arial" w:eastAsia="Arial" w:hAnsi="Arial"/>
-          <w:b w:val="0"/>
-          <w:i w:val="0"/>
-          <w:smallCaps w:val="0"/>
-          <w:strike w:val="0"/>
-          <w:color w:val="000000"/>
-          <w:sz w:val="20"/>
-          <w:szCs w:val="20"/>
-          <w:u w:val="none"/>
-          <w:shd w:fill="auto" w:val="clear"/>
-          <w:vertAlign w:val="baseline"/>
-          <w:rtl w:val="0"/>
-        </w:rPr>
-        <w:t xml:space="preserve"> months. All amounts shall be payable to the Sellers in proportion to their respective holdings of the Shares.</w:t>
+        <w:t xml:space="preserve">The Price is to be satisfied by the payment of £{{dayOnePayment}} in cash on completion of the Proposed Acquisition and the remaining balance to be payable in equal monthly instalments over X months. All amounts shall be payable to the Sellers in proportion to their respective holdings of the Shares.</w:t>
       </w:r>
     </w:p>
     <w:p>
@@ -1796,30 +1177,7 @@
           <w:vertAlign w:val="baseline"/>
           <w:rtl w:val="0"/>
         </w:rPr>
-        <w:t xml:space="preserve">The Price will be subject to adjustment for any outstanding indebtedness due and payable by the Company which has not been satisfied prior to Completion</w:t>
-      </w:r>
-      <w:r>
-        <w:rPr>
-          <w:rtl w:val="0"/>
-        </w:rPr>
-        <w:t xml:space="preserve">.</w:t>
-      </w:r>
-      <w:r>
-        <w:rPr>
-          <w:rFonts w:ascii="Arial" w:cs="Arial" w:eastAsia="Arial" w:hAnsi="Arial"/>
-          <w:b w:val="0"/>
-          <w:i w:val="0"/>
-          <w:smallCaps w:val="0"/>
-          <w:strike w:val="0"/>
-          <w:color w:val="000000"/>
-          <w:sz w:val="20"/>
-          <w:szCs w:val="20"/>
-          <w:u w:val="none"/>
-          <w:shd w:fill="auto" w:val="clear"/>
-          <w:vertAlign w:val="baseline"/>
-          <w:rtl w:val="0"/>
-        </w:rPr>
-        <w:t xml:space="preserve"> The total amount of indebtedness, if any, shall be agreed between the Parties during the due diligence process and prior to Completion.</w:t>
+        <w:t xml:space="preserve">The Price will be subject to adjustment for any outstanding indebtedness due and payable by the Company which has not been satisfied prior to Completion. The total amount of indebtedness, if any, shall be agreed between the Parties during the due diligence process and prior to Completion.</w:t>
       </w:r>
     </w:p>
     <w:p>
@@ -2235,15 +1593,34 @@
           <w:vertAlign w:val="baseline"/>
           <w:rtl w:val="0"/>
         </w:rPr>
-        <w:t xml:space="preserve">Satisfactory training will be provided on the Company's </w:t>
-      </w:r>
-      <w:r>
+        <w:t xml:space="preserve">Satisfactory training will be provided on the Company's CRM system’s &amp; front of house system to the Buyer by current staff of the Company; and</w:t>
+      </w:r>
+    </w:p>
+    <w:p>
+      <w:pPr>
+        <w:keepNext w:val="0"/>
+        <w:keepLines w:val="0"/>
+        <w:pageBreakBefore w:val="0"/>
+        <w:widowControl w:val="1"/>
+        <w:numPr>
+          <w:ilvl w:val="2"/>
+          <w:numId w:val="1"/>
+        </w:numPr>
+        <w:pBdr>
+          <w:top w:space="0" w:sz="0" w:val="nil"/>
+          <w:left w:space="0" w:sz="0" w:val="nil"/>
+          <w:bottom w:space="0" w:sz="0" w:val="nil"/>
+          <w:right w:space="0" w:sz="0" w:val="nil"/>
+          <w:between w:space="0" w:sz="0" w:val="nil"/>
+        </w:pBdr>
+        <w:shd w:fill="auto" w:val="clear"/>
+        <w:spacing w:after="240" w:before="0" w:line="300" w:lineRule="auto"/>
+        <w:ind w:left="1701" w:right="0" w:hanging="850"/>
+        <w:jc w:val="both"/>
         <w:rPr>
           <w:highlight w:val="yellow"/>
-          <w:rtl w:val="0"/>
-        </w:rPr>
-        <w:t xml:space="preserve">CRM </w:t>
-      </w:r>
+        </w:rPr>
+      </w:pPr>
       <w:r>
         <w:rPr>
           <w:rFonts w:ascii="Arial" w:cs="Arial" w:eastAsia="Arial" w:hAnsi="Arial"/>
@@ -2259,81 +1636,7 @@
           <w:vertAlign w:val="baseline"/>
           <w:rtl w:val="0"/>
         </w:rPr>
-        <w:t xml:space="preserve">system</w:t>
-      </w:r>
-      <w:r>
-        <w:rPr>
-          <w:highlight w:val="yellow"/>
-          <w:rtl w:val="0"/>
-        </w:rPr>
-        <w:t xml:space="preserve">’s</w:t>
-      </w:r>
-      <w:r>
-        <w:rPr>
-          <w:rFonts w:ascii="Arial" w:cs="Arial" w:eastAsia="Arial" w:hAnsi="Arial"/>
-          <w:b w:val="0"/>
-          <w:i w:val="0"/>
-          <w:smallCaps w:val="0"/>
-          <w:strike w:val="0"/>
-          <w:color w:val="000000"/>
-          <w:sz w:val="20"/>
-          <w:szCs w:val="20"/>
-          <w:highlight w:val="yellow"/>
-          <w:u w:val="none"/>
-          <w:vertAlign w:val="baseline"/>
-          <w:rtl w:val="0"/>
-        </w:rPr>
-        <w:t xml:space="preserve"> &amp; front of house system to the Buyer by current staff of the Company; and</w:t>
-      </w:r>
-    </w:p>
-    <w:p>
-      <w:pPr>
-        <w:keepNext w:val="0"/>
-        <w:keepLines w:val="0"/>
-        <w:pageBreakBefore w:val="0"/>
-        <w:widowControl w:val="1"/>
-        <w:numPr>
-          <w:ilvl w:val="2"/>
-          <w:numId w:val="1"/>
-        </w:numPr>
-        <w:pBdr>
-          <w:top w:space="0" w:sz="0" w:val="nil"/>
-          <w:left w:space="0" w:sz="0" w:val="nil"/>
-          <w:bottom w:space="0" w:sz="0" w:val="nil"/>
-          <w:right w:space="0" w:sz="0" w:val="nil"/>
-          <w:between w:space="0" w:sz="0" w:val="nil"/>
-        </w:pBdr>
-        <w:shd w:fill="auto" w:val="clear"/>
-        <w:spacing w:after="240" w:before="0" w:line="300" w:lineRule="auto"/>
-        <w:ind w:left="1701" w:right="0" w:hanging="850"/>
-        <w:jc w:val="both"/>
-        <w:rPr>
-          <w:highlight w:val="yellow"/>
-        </w:rPr>
-      </w:pPr>
-      <w:r>
-        <w:rPr>
-          <w:rFonts w:ascii="Arial" w:cs="Arial" w:eastAsia="Arial" w:hAnsi="Arial"/>
-          <w:b w:val="0"/>
-          <w:i w:val="0"/>
-          <w:smallCaps w:val="0"/>
-          <w:strike w:val="0"/>
-          <w:color w:val="000000"/>
-          <w:sz w:val="20"/>
-          <w:szCs w:val="20"/>
-          <w:highlight w:val="yellow"/>
-          <w:u w:val="none"/>
-          <w:vertAlign w:val="baseline"/>
-          <w:rtl w:val="0"/>
-        </w:rPr>
-        <w:t xml:space="preserve">There are no loans or other borrowings outstanding from the Company</w:t>
-      </w:r>
-      <w:r>
-        <w:rPr>
-          <w:highlight w:val="yellow"/>
-          <w:rtl w:val="0"/>
-        </w:rPr>
-        <w:t xml:space="preserve">.</w:t>
+        <w:t xml:space="preserve">There are no loans or other borrowings outstanding from the Company.</w:t>
       </w:r>
       <w:r>
         <w:rPr>
@@ -2696,24 +1999,7 @@
         <w:rPr>
           <w:rtl w:val="0"/>
         </w:rPr>
-        <w:t xml:space="preserve">The</w:t>
-      </w:r>
-      <w:r>
-        <w:rPr>
-          <w:rFonts w:ascii="Arial" w:cs="Arial" w:eastAsia="Arial" w:hAnsi="Arial"/>
-          <w:b w:val="0"/>
-          <w:i w:val="0"/>
-          <w:smallCaps w:val="0"/>
-          <w:strike w:val="0"/>
-          <w:color w:val="000000"/>
-          <w:sz w:val="20"/>
-          <w:szCs w:val="20"/>
-          <w:u w:val="none"/>
-          <w:shd w:fill="auto" w:val="clear"/>
-          <w:vertAlign w:val="baseline"/>
-          <w:rtl w:val="0"/>
-        </w:rPr>
-        <w:t xml:space="preserve"> Company is fully up to date with all tax affairs and has no outstanding investigations, enquiries or other outstanding amounts owing to HM Revenue and Customs.</w:t>
+        <w:t xml:space="preserve">The Company is fully up to date with all tax affairs and has no outstanding investigations, enquiries or other outstanding amounts owing to HM Revenue and Customs.</w:t>
       </w:r>
     </w:p>
     <w:p>
@@ -2872,13 +2158,7 @@
           <w:vertAlign w:val="baseline"/>
           <w:rtl w:val="0"/>
         </w:rPr>
-        <w:t xml:space="preserve">taken or threatened to take any action which would be materially inconsistent with any of the warranties given by the Sellers in the SPA</w:t>
-      </w:r>
-      <w:r>
-        <w:rPr>
-          <w:rtl w:val="0"/>
-        </w:rPr>
-        <w:t xml:space="preserve">.</w:t>
+        <w:t xml:space="preserve">taken or threatened to take any action which would be materially inconsistent with any of the warranties given by the Sellers in the SPA.</w:t>
       </w:r>
       <w:r>
         <w:rPr>
@@ -3268,41 +2548,7 @@
           <w:vertAlign w:val="baseline"/>
           <w:rtl w:val="0"/>
         </w:rPr>
-        <w:t xml:space="preserve">The Sellers will provide the Buyer with appropriate warranties for a transaction of this nature relating to the Company and its business, assets and liabilities to be given by the Sellers on a joint and several basis (</w:t>
-      </w:r>
-      <w:r>
-        <w:rPr>
-          <w:rFonts w:ascii="Arial" w:cs="Arial" w:eastAsia="Arial" w:hAnsi="Arial"/>
-          <w:b w:val="1"/>
-          <w:i w:val="0"/>
-          <w:smallCaps w:val="0"/>
-          <w:strike w:val="0"/>
-          <w:color w:val="000000"/>
-          <w:sz w:val="20"/>
-          <w:szCs w:val="20"/>
-          <w:u w:val="none"/>
-          <w:shd w:fill="auto" w:val="clear"/>
-          <w:vertAlign w:val="baseline"/>
-          <w:rtl w:val="0"/>
-        </w:rPr>
-        <w:t xml:space="preserve">Warranties</w:t>
-      </w:r>
-      <w:r>
-        <w:rPr>
-          <w:rFonts w:ascii="Arial" w:cs="Arial" w:eastAsia="Arial" w:hAnsi="Arial"/>
-          <w:b w:val="0"/>
-          <w:i w:val="0"/>
-          <w:smallCaps w:val="0"/>
-          <w:strike w:val="0"/>
-          <w:color w:val="000000"/>
-          <w:sz w:val="20"/>
-          <w:szCs w:val="20"/>
-          <w:u w:val="none"/>
-          <w:shd w:fill="auto" w:val="clear"/>
-          <w:vertAlign w:val="baseline"/>
-          <w:rtl w:val="0"/>
-        </w:rPr>
-        <w:t xml:space="preserve">).  The Warranties will include (without limitation) full warranties as to the ownership of the Shares, the accuracy of statements relating to the Company, the Company's legal, financial, commercial, corporate, trading, property, employment, environmental, asset and employee benefits matters;</w:t>
+        <w:t xml:space="preserve">The Sellers will provide the Buyer with appropriate warranties for a transaction of this nature relating to the Company and its business, assets and liabilities to be given by the Sellers on a joint and several basis (Warranties).  The Warranties will include (without limitation) full warranties as to the ownership of the Shares, the accuracy of statements relating to the Company, the Company's legal, financial, commercial, corporate, trading, property, employment, environmental, asset and employee benefits matters;</w:t>
       </w:r>
     </w:p>
     <w:p>
@@ -3660,24 +2906,7 @@
         <w:rPr>
           <w:rtl w:val="0"/>
         </w:rPr>
-        <w:t xml:space="preserve">The</w:t>
-      </w:r>
-      <w:r>
-        <w:rPr>
-          <w:rFonts w:ascii="Arial" w:cs="Arial" w:eastAsia="Arial" w:hAnsi="Arial"/>
-          <w:b w:val="0"/>
-          <w:i w:val="0"/>
-          <w:smallCaps w:val="0"/>
-          <w:strike w:val="0"/>
-          <w:color w:val="000000"/>
-          <w:sz w:val="20"/>
-          <w:szCs w:val="20"/>
-          <w:u w:val="none"/>
-          <w:shd w:fill="auto" w:val="clear"/>
-          <w:vertAlign w:val="baseline"/>
-          <w:rtl w:val="0"/>
-        </w:rPr>
-        <w:t xml:space="preserve"> Sellers will have no liability under the Warranties unless the value of the claim (when aggregated with any other warranty claims having a value in excess of £5,000) exceeds £5,000, in which case the Sellers will be liable for the whole amount of the claim and not just the excess.</w:t>
+        <w:t xml:space="preserve">The Sellers will have no liability under the Warranties unless the value of the claim (when aggregated with any other warranty claims having a value in excess of £5,000) exceeds £5,000, in which case the Sellers will be liable for the whole amount of the claim and not just the excess.</w:t>
       </w:r>
     </w:p>
     <w:p>
@@ -3964,31 +3193,7 @@
           <w:vertAlign w:val="baseline"/>
           <w:rtl w:val="0"/>
         </w:rPr>
-        <w:t xml:space="preserve">The Buyer intends to proceed as quickly as possible with the Proposed Acquisition. The Buyer and the Sellers will negotiate in good faith with a view to, signing and completing the Proposed Acquisition on or before </w:t>
-      </w:r>
-      <w:r>
-        <w:rPr>
-          <w:highlight w:val="yellow"/>
-          <w:rtl w:val="0"/>
-        </w:rPr>
-        <w:t xml:space="preserve">[Date]</w:t>
-      </w:r>
-      <w:r>
-        <w:rPr>
-          <w:rFonts w:ascii="Arial" w:cs="Arial" w:eastAsia="Arial" w:hAnsi="Arial"/>
-          <w:b w:val="0"/>
-          <w:i w:val="0"/>
-          <w:smallCaps w:val="0"/>
-          <w:strike w:val="0"/>
-          <w:color w:val="000000"/>
-          <w:sz w:val="20"/>
-          <w:szCs w:val="20"/>
-          <w:u w:val="none"/>
-          <w:shd w:fill="auto" w:val="clear"/>
-          <w:vertAlign w:val="baseline"/>
-          <w:rtl w:val="0"/>
-        </w:rPr>
-        <w:t xml:space="preserve"> (or as otherwise agreed between the parties).</w:t>
+        <w:t xml:space="preserve">The Buyer intends to proceed as quickly as possible with the Proposed Acquisition. The Buyer and the Sellers will negotiate in good faith with a view to, signing and completing the Proposed Acquisition on or before [Date] (or as otherwise agreed between the parties).</w:t>
       </w:r>
     </w:p>
     <w:p>
@@ -4113,65 +3318,7 @@
           <w:vertAlign w:val="baseline"/>
           <w:rtl w:val="0"/>
         </w:rPr>
-        <w:t xml:space="preserve">In consideration of the Buyer incurring fees, expenses and other costs in connection with, and committing management time and resources to, its due diligence investigations and negotiation of the Proposed Acquisition, the Sellers jointly and severally agree and undertake with the Buyer that they will not (and will procure that the Company nor any of its officers, employees, agents or advisers), directly or indirectly, at any time before </w:t>
-      </w:r>
-      <w:r>
-        <w:rPr>
-          <w:highlight w:val="yellow"/>
-          <w:rtl w:val="0"/>
-        </w:rPr>
-        <w:t xml:space="preserve">[Date]</w:t>
-      </w:r>
-      <w:r>
-        <w:rPr>
-          <w:rFonts w:ascii="Arial" w:cs="Arial" w:eastAsia="Arial" w:hAnsi="Arial"/>
-          <w:b w:val="0"/>
-          <w:i w:val="0"/>
-          <w:smallCaps w:val="0"/>
-          <w:strike w:val="0"/>
-          <w:color w:val="000000"/>
-          <w:sz w:val="20"/>
-          <w:szCs w:val="20"/>
-          <w:u w:val="none"/>
-          <w:shd w:fill="auto" w:val="clear"/>
-          <w:vertAlign w:val="baseline"/>
-          <w:rtl w:val="0"/>
-        </w:rPr>
-        <w:t xml:space="preserve"> (the </w:t>
-      </w:r>
-      <w:r>
-        <w:rPr>
-          <w:rFonts w:ascii="Arial" w:cs="Arial" w:eastAsia="Arial" w:hAnsi="Arial"/>
-          <w:b w:val="1"/>
-          <w:i w:val="0"/>
-          <w:smallCaps w:val="0"/>
-          <w:strike w:val="0"/>
-          <w:color w:val="000000"/>
-          <w:sz w:val="20"/>
-          <w:szCs w:val="20"/>
-          <w:u w:val="none"/>
-          <w:shd w:fill="auto" w:val="clear"/>
-          <w:vertAlign w:val="baseline"/>
-          <w:rtl w:val="0"/>
-        </w:rPr>
-        <w:t xml:space="preserve">Exclusivity Period</w:t>
-      </w:r>
-      <w:r>
-        <w:rPr>
-          <w:rFonts w:ascii="Arial" w:cs="Arial" w:eastAsia="Arial" w:hAnsi="Arial"/>
-          <w:b w:val="0"/>
-          <w:i w:val="0"/>
-          <w:smallCaps w:val="0"/>
-          <w:strike w:val="0"/>
-          <w:color w:val="000000"/>
-          <w:sz w:val="20"/>
-          <w:szCs w:val="20"/>
-          <w:u w:val="none"/>
-          <w:shd w:fill="auto" w:val="clear"/>
-          <w:vertAlign w:val="baseline"/>
-          <w:rtl w:val="0"/>
-        </w:rPr>
-        <w:t xml:space="preserve">):</w:t>
+        <w:t xml:space="preserve">In consideration of the Buyer incurring fees, expenses and other costs in connection with, and committing management time and resources to, its due diligence investigations and negotiation of the Proposed Acquisition, the Sellers jointly and severally agree and undertake with the Buyer that they will not (and will procure that the Company nor any of its officers, employees, agents or advisers), directly or indirectly, at any time before [Date] (the Exclusivity Period):</w:t>
       </w:r>
     </w:p>
     <w:p>
@@ -4212,41 +3359,7 @@
           <w:vertAlign w:val="baseline"/>
           <w:rtl w:val="0"/>
         </w:rPr>
-        <w:t xml:space="preserve">make available information of any nature whatsoever about the Company, its business, assets or liabilities to any party other than the Buyer (a </w:t>
-      </w:r>
-      <w:r>
-        <w:rPr>
-          <w:rFonts w:ascii="Arial" w:cs="Arial" w:eastAsia="Arial" w:hAnsi="Arial"/>
-          <w:b w:val="1"/>
-          <w:i w:val="0"/>
-          <w:smallCaps w:val="0"/>
-          <w:strike w:val="0"/>
-          <w:color w:val="000000"/>
-          <w:sz w:val="20"/>
-          <w:szCs w:val="20"/>
-          <w:u w:val="none"/>
-          <w:shd w:fill="auto" w:val="clear"/>
-          <w:vertAlign w:val="baseline"/>
-          <w:rtl w:val="0"/>
-        </w:rPr>
-        <w:t xml:space="preserve">Third Party</w:t>
-      </w:r>
-      <w:r>
-        <w:rPr>
-          <w:rFonts w:ascii="Arial" w:cs="Arial" w:eastAsia="Arial" w:hAnsi="Arial"/>
-          <w:b w:val="0"/>
-          <w:i w:val="0"/>
-          <w:smallCaps w:val="0"/>
-          <w:strike w:val="0"/>
-          <w:color w:val="000000"/>
-          <w:sz w:val="20"/>
-          <w:szCs w:val="20"/>
-          <w:u w:val="none"/>
-          <w:shd w:fill="auto" w:val="clear"/>
-          <w:vertAlign w:val="baseline"/>
-          <w:rtl w:val="0"/>
-        </w:rPr>
-        <w:t xml:space="preserve">) for the purpose of evaluating, or deciding whether to pursue or make an offer in connection with, a Restricted Activity; </w:t>
+        <w:t xml:space="preserve">make available information of any nature whatsoever about the Company, its business, assets or liabilities to any party other than the Buyer (a Third Party) for the purpose of evaluating, or deciding whether to pursue or make an offer in connection with, a Restricted Activity; </w:t>
       </w:r>
     </w:p>
     <w:p>
@@ -4574,41 +3687,7 @@
           <w:vertAlign w:val="baseline"/>
           <w:rtl w:val="0"/>
         </w:rPr>
-        <w:t xml:space="preserve">For the purposes of this paragraph 9, </w:t>
-      </w:r>
-      <w:r>
-        <w:rPr>
-          <w:rFonts w:ascii="Arial" w:cs="Arial" w:eastAsia="Arial" w:hAnsi="Arial"/>
-          <w:b w:val="1"/>
-          <w:i w:val="0"/>
-          <w:smallCaps w:val="0"/>
-          <w:strike w:val="0"/>
-          <w:color w:val="000000"/>
-          <w:sz w:val="20"/>
-          <w:szCs w:val="20"/>
-          <w:u w:val="none"/>
-          <w:shd w:fill="auto" w:val="clear"/>
-          <w:vertAlign w:val="baseline"/>
-          <w:rtl w:val="0"/>
-        </w:rPr>
-        <w:t xml:space="preserve">Restricted Activity</w:t>
-      </w:r>
-      <w:r>
-        <w:rPr>
-          <w:rFonts w:ascii="Arial" w:cs="Arial" w:eastAsia="Arial" w:hAnsi="Arial"/>
-          <w:b w:val="0"/>
-          <w:i w:val="0"/>
-          <w:smallCaps w:val="0"/>
-          <w:strike w:val="0"/>
-          <w:color w:val="000000"/>
-          <w:sz w:val="20"/>
-          <w:szCs w:val="20"/>
-          <w:u w:val="none"/>
-          <w:shd w:fill="auto" w:val="clear"/>
-          <w:vertAlign w:val="baseline"/>
-          <w:rtl w:val="0"/>
-        </w:rPr>
-        <w:t xml:space="preserve"> means any investment in the Company or the disposal (whether by way of sale, offer, transfer or otherwise) of all or any part of, or any interest in, the issued share capital of the Company; or the disposal (whether by way of sale, offer, transfer or otherwise) of all, or any [material] part of the business or assets of the Company other than in the ordinary course of trading.</w:t>
+        <w:t xml:space="preserve">For the purposes of this paragraph 9, Restricted Activity means any investment in the Company or the disposal (whether by way of sale, offer, transfer or otherwise) of all or any part of, or any interest in, the issued share capital of the Company; or the disposal (whether by way of sale, offer, transfer or otherwise) of all, or any [material] part of the business or assets of the Company other than in the ordinary course of trading.</w:t>
       </w:r>
     </w:p>
     <w:p>
@@ -4938,30 +4017,7 @@
           <w:vertAlign w:val="baseline"/>
           <w:rtl w:val="0"/>
         </w:rPr>
-        <w:t xml:space="preserve">This paragraph 1</w:t>
-      </w:r>
-      <w:r>
-        <w:rPr>
-          <w:rtl w:val="0"/>
-        </w:rPr>
-        <w:t xml:space="preserve">0</w:t>
-      </w:r>
-      <w:r>
-        <w:rPr>
-          <w:rFonts w:ascii="Arial" w:cs="Arial" w:eastAsia="Arial" w:hAnsi="Arial"/>
-          <w:b w:val="0"/>
-          <w:i w:val="0"/>
-          <w:smallCaps w:val="0"/>
-          <w:strike w:val="0"/>
-          <w:color w:val="000000"/>
-          <w:sz w:val="20"/>
-          <w:szCs w:val="20"/>
-          <w:u w:val="none"/>
-          <w:shd w:fill="auto" w:val="clear"/>
-          <w:vertAlign w:val="baseline"/>
-          <w:rtl w:val="0"/>
-        </w:rPr>
-        <w:t xml:space="preserve"> is legally binding.</w:t>
+        <w:t xml:space="preserve">This paragraph 10 is legally binding.</w:t>
       </w:r>
     </w:p>
     <w:p>

</xml_diff>

<commit_message>
Fix malformed XML in document template for Heads of Terms
Correct an invalid XML tag within the `system_heads_of_terms.docx` template file, resolving an issue with double closing tags.

Replit-Commit-Author: Agent
Replit-Commit-Session-Id: 46dee099-bbbd-4adf-9498-84644db411ed
Replit-Commit-Checkpoint-Type: full_checkpoint
Replit-Commit-Event-Id: 92654401-e7e3-494c-8e5e-f760970dc347
Replit-Commit-Screenshot-Url: https://storage.googleapis.com/screenshot-production-us-central1/85fb53ef-8f2a-4b29-b64b-c651f49dfeb5/46dee099-bbbd-4adf-9498-84644db411ed/Lh5zK26
Replit-Helium-Checkpoint-Created: true
</commit_message>
<xml_diff>
--- a/data/templates/system_heads_of_terms.docx
+++ b/data/templates/system_heads_of_terms.docx
@@ -1,138 +1,622 @@
 
-<file path=word/document.xml><?xml version="1.0" encoding="UTF-8" standalone="yes"?>
+<file path=word/document.xml><?xml version="1.0" encoding="utf-8"?>
 <w:document xmlns:w="http://schemas.openxmlformats.org/wordprocessingml/2006/main">
-<w:body>
-
-<w:p><w:r><w:rPr><w:b/></w:rPr><w:t>PRIVATE AND CONFIDENTIAL — SUBJECT TO CONTRACT</w:t></w:r></w:p>
-<w:p><w:r><w:t></w:t></w:r></w:p>
-<w:p><w:r><w:t>{{sellerCompanyName}}</w:t></w:r></w:p>
-<w:p><w:r><w:t>{{sellerAddress}}</w:t></w:r></w:p>
-<w:p><w:r><w:t></w:t></w:r></w:p>
-<w:p><w:r><w:t>{{currentDate}}</w:t></w:r></w:p>
-<w:p><w:r><w:t></w:t></w:r></w:p>
-<w:p><w:r><w:rPr><w:b/></w:rPr><w:t>HEADS OF TERMS — PROPOSED ACQUISITION OF {{sellerCompanyName}} ({{transactionTypeLabel}})</w:t></w:r></w:p>
-<w:p><w:r><w:t></w:t></w:r></w:p>
-<w:p><w:r><w:t>Dear {{sellerContactName}},</w:t></w:r></w:p>
-<w:p><w:r><w:t></w:t></w:r></w:p>
-<w:p><w:r><w:t>Further to our recent discussions, this letter sets out the principal terms upon which {{buyerCompanyName}} (the Buyer) is willing to acquire {{transactionDescription}} of {{sellerCompanyName}} (the Company). Save where expressly stated to be binding, this letter is non-binding and subject to contract.</w:t></w:r></w:p>
-<w:p><w:r><w:t></w:t></w:r></w:p>
-
-<w:p><w:r><w:rPr><w:b/></w:rPr><w:t>1. PARTIES AND TRANSACTION OVERVIEW (Non-Binding)</w:t></w:r></w:p>
-<w:p><w:r><w:t></w:t></w:r></w:p>
-<w:p><w:r><w:t>Buyer: {{buyerCompanyName}}</w:t></w:r></w:p>
-<w:p><w:r><w:t>Seller: {{sellerContactName}}, {{sellerCompanyName}}</w:t></w:r></w:p>
-<w:p><w:r><w:t>Transaction: Proposed {{transactionTypeLabel}} of {{sellerCompanyName}}</w:t></w:r></w:p>
-<w:p><w:r><w:t></w:t></w:r></w:p>
-
-<w:p><w:r><w:rPr><w:b/></w:rPr><w:t>2. PRICE AND CONSIDERATION (Non-Binding)</w:t></w:r></w:p>
-<w:p><w:r><w:t></w:t></w:r></w:p>
-<w:p><w:r><w:t>The total consideration for the acquisition is {{offerPrice}} (the Price), structured as follows:</w:t></w:r></w:p>
-<w:p><w:r><w:t></w:t></w:r></w:p>
-<w:p><w:r><w:t>{{paymentText}}</w:t></w:r></w:p>
-<w:p><w:r><w:t></w:t></w:t></w:r></w:p>
-<w:p><w:r><w:t>2.1 Cash at Completion: {{dayOnePayment}} payable to the Seller on the Completion Date.</w:t></w:r></w:p>
-<w:p><w:r><w:t></w:t></w:r></w:p>
-<w:p><w:r><w:t>2.2 Deferred Consideration: {{deferredTotal}}{{deferredInstalment}}</w:t></w:r></w:p>
-<w:p><w:r><w:t></w:t></w:r></w:p>
-<w:p><w:r><w:t>2.3 Earnout: {{earnoutMaximum}}{{earnoutMetric}}{{earnoutTermMonths}}</w:t></w:r></w:p>
-<w:p><w:r><w:t></w:t></w:r></w:p>
-
-<w:p><w:r><w:rPr><w:b/></w:rPr><w:t>3. PRICE ASSUMPTIONS (Non-Binding)</w:t></w:r></w:p>
-<w:p><w:r><w:t></w:t></w:r></w:p>
-<w:p><w:r><w:t>The Price is calculated on the following basis:</w:t></w:r></w:p>
-<w:p><w:r><w:t></w:t></w:r></w:p>
-<w:p><w:r><w:t>{{breakdownText}}</w:t></w:r></w:p>
-<w:p><w:r><w:t></w:t></w:r></w:p>
-<w:p><w:r><w:t>The Price is on a cash-free, debt-free basis, subject to a normalised level of working capital. Final Price will be adjusted through a completion accounts mechanism to reflect the actual cash, debt, and working capital position at the Completion Date.</w:t></w:r></w:p>
-<w:p><w:r><w:t></w:t></w:r></w:p>
-
-<w:p><w:r><w:rPr><w:b/></w:rPr><w:t>4. CONDITIONS PRECEDENT (Non-Binding)</w:t></w:r></w:p>
-<w:p><w:r><w:t></w:t></w:r></w:p>
-<w:p><w:r><w:t>The Proposed Acquisition is conditional upon:</w:t></w:r></w:p>
-<w:p><w:r><w:t>(a) Satisfactory completion of legal and financial due diligence by the Buyer;</w:t></w:r></w:p>
-<w:p><w:r><w:t>(b) Agreement and execution of a formal Sale and Purchase Agreement;</w:t></w:r></w:p>
-<w:p><w:r><w:t>(c) Confirmation of funding arrangements satisfactory to the Buyer;</w:t></w:r></w:p>
-<w:p><w:r><w:t>(d) No material adverse change in the business, assets, or financial position of the Company prior to Completion.</w:t></w:r></w:p>
-<w:p><w:r><w:t></w:t></w:r></w:p>
-<w:p><w:r><w:t>{{additionalConditions}}</w:t></w:r></w:p>
-<w:p><w:r><w:t></w:t></w:r></w:p>
-
-<w:p><w:r><w:rPr><w:b/></w:rPr><w:t>5. DUE DILIGENCE (Non-Binding)</w:t></w:r></w:p>
-<w:p><w:r><w:t></w:t></w:r></w:p>
-<w:p><w:r><w:t>The Buyer will conduct legal, financial, tax, and commercial due diligence on the Company. The Seller agrees to provide, and procure that the Company provides, all reasonable access to information, personnel, and records as requested. Due diligence will be conducted on a confidential basis and subject to the NDA previously agreed between the parties.</w:t></w:r></w:p>
-<w:p><w:r><w:t></w:t></w:r></w:p>
-
-<w:p><w:r><w:rPr><w:b/></w:rPr><w:t>6. TIMETABLE (Non-Binding)</w:t></w:r></w:p>
-<w:p><w:r><w:t></w:t></w:r></w:p>
-<w:p><w:r><w:t>The parties will use reasonable endeavours to achieve completion of the Proposed Acquisition within {{targetCompletionWeeks}} weeks of the date of this letter, subject to satisfactory completion of due diligence and agreement of the Sale and Purchase Agreement.</w:t></w:r></w:p>
-<w:p><w:r><w:t></w:t></w:r></w:p>
-
-<w:p><w:r><w:rPr><w:b/></w:rPr><w:t>7. EXCLUSIVITY (Binding)</w:t></w:r></w:p>
-<w:p><w:r><w:t></w:t></w:r></w:p>
-<w:p><w:r><w:t>In consideration of the Buyer incurring costs in connection with the Proposed Acquisition, the Seller undertakes that for a period of {{exclusivityPeriodDays}} days from the date of this letter (the Exclusivity Period) the Seller shall not, and shall procure that neither the Company nor any agent acting on its behalf shall:</w:t></w:r></w:p>
-<w:p><w:r><w:t>(a) solicit, encourage, or entertain any approach from any third party relating to the sale or disposal of the Company or its business or assets;</w:t></w:r></w:p>
-<w:p><w:r><w:t>(b) enter into any negotiations or discussions with any third party in relation to such a transaction; or</w:t></w:r></w:p>
-<w:p><w:r><w:t>(c) provide any information to any third party in connection with any such transaction.</w:t></w:r></w:p>
-<w:p><w:r><w:t></w:t></w:r></w:p>
-<w:p><w:r><w:t>This clause 7 is binding on the parties.</w:t></w:r></w:p>
-<w:p><w:r><w:t></w:t></w:r></w:p>
-
-<w:p><w:r><w:rPr><w:b/></w:rPr><w:t>8. NON-COMPETE AND NON-SOLICITATION (Non-Binding)</w:t></w:r></w:p>
-<w:p><w:r><w:t></w:t></w:r></w:p>
-<w:p><w:r><w:t>It is intended that the Sale and Purchase Agreement will include undertakings by the Seller that for a period of {{nonCompetePeriodYears}} years following Completion, the Seller will not:</w:t></w:r></w:p>
-<w:p><w:r><w:t>(a) carry on or be engaged or interested in any business which competes with the business of the Company as at Completion;</w:t></w:r></w:p>
-<w:p><w:r><w:t>(b) solicit or entice away any employee, customer, or supplier of the Company for a period of {{nonSolicitPeriodYears}} years following Completion.</w:t></w:r></w:p>
-<w:p><w:r><w:t></w:t></w:r></w:p>
-
-<w:p><w:r><w:rPr><w:b/></w:rPr><w:t>9. WARRANTIES AND INDEMNITIES (Non-Binding)</w:t></w:r></w:p>
-<w:p><w:r><w:t></w:t></w:r></w:p>
-<w:p><w:r><w:t>The Sale and Purchase Agreement will include customary warranties from the Seller regarding the Company. It is intended that:</w:t></w:r></w:p>
-<w:p><w:r><w:t>(a) Warranty claims must be notified within {{warrantyClaimPeriodMonths}} months of Completion;</w:t></w:r></w:p>
-<w:p><w:r><w:t>(b) The minimum individual claim threshold is {{warrantyMinClaim}};</w:t></w:r></w:p>
-<w:p><w:r><w:t>(c) The aggregate warranty cap will be agreed during the SPA negotiation.</w:t></w:r></w:p>
-<w:p><w:r><w:t></w:t></w:r></w:p>
-
-<w:p><w:r><w:rPr><w:b/></w:rPr><w:t>10. SALE AND PURCHASE AGREEMENT (Non-Binding)</w:t></w:r></w:p>
-<w:p><w:r><w:t></w:t></w:r></w:p>
-<w:p><w:r><w:t>The Proposed Acquisition will be documented by a formal Sale and Purchase Agreement to be prepared by the Buyer's solicitors. The SPA will be in a form customary for a transaction of this nature and will reflect the terms set out in this letter together with such other terms as are agreed between the parties during due diligence and negotiation.</w:t></w:r></w:p>
-<w:p><w:r><w:t></w:t></w:r></w:p>
-
-<w:p><w:r><w:rPr><w:b/></w:rPr><w:t>11. EMPLOYEES (Non-Binding)</w:t></w:r></w:p>
-<w:p><w:r><w:t></w:t></w:r></w:p>
-<w:p><w:r><w:t>The Buyer intends to retain all existing employees of the Company following Completion. The transaction will be subject to applicable employment legislation including TUPE where relevant. Key management arrangements will be discussed and agreed during the due diligence period.</w:t></w:r></w:p>
-<w:p><w:r><w:t></w:t></w:r></w:p>
-
-<w:p><w:r><w:rPr><w:b/></w:rPr><w:t>12. COSTS (Binding)</w:t></w:r></w:p>
-<w:p><w:r><w:t></w:t></w:r></w:p>
-<w:p><w:r><w:t>Each party shall bear their own legal and professional costs incurred in connection with the Proposed Acquisition, whether or not the transaction proceeds to Completion. This clause 12 is binding on the parties.</w:t></w:r></w:p>
-<w:p><w:r><w:t></w:t></w:r></w:p>
-
-<w:p><w:r><w:rPr><w:b/></w:rPr><w:t>13. ANNOUNCEMENTS (Binding)</w:t></w:r></w:p>
-<w:p><w:r><w:t></w:t></w:r></w:p>
-<w:p><w:r><w:t>Neither party shall make any public announcement or disclosure in connection with the Proposed Acquisition without the prior written consent of the other party, save as required by law or regulation. This clause 13 is binding on the parties.</w:t></w:r></w:p>
-<w:p><w:r><w:t></w:t></w:r></w:p>
-
-<w:p><w:r><w:rPr><w:b/></w:rPr><w:t>14. GOVERNING LAW (Binding)</w:t></w:r></w:p>
-<w:p><w:r><w:t></w:t></w:r></w:p>
-<w:p><w:r><w:t>This letter and any non-contractual obligations arising from or in connection with it shall be governed by and construed in accordance with the laws of England and Wales. The parties submit to the exclusive jurisdiction of the courts of England and Wales. This clause 14 is binding on the parties.</w:t></w:r></w:p>
-<w:p><w:r><w:t></w:t></w:r></w:p>
-
-<w:p><w:r><w:t>Please confirm your agreement to the above terms by signing and returning a copy of this letter.</w:t></w:r></w:p>
-<w:p><w:r><w:t></w:t></w:r></w:p>
-<w:p><w:r><w:t>Yours sincerely,</w:t></w:r></w:p>
-<w:p><w:r><w:t></w:t></w:r></w:p>
-<w:p><w:r><w:t>{{buyerSignatoryName}}</w:t></w:r></w:p>
-<w:p><w:r><w:t>{{buyerSignatoryTitle}}</w:t></w:r></w:p>
-<w:p><w:r><w:t>{{buyerCompanyName}}</w:t></w:r></w:p>
-<w:p><w:r><w:t></w:t></w:r></w:p>
-<w:p><w:r><w:t>Agreed and accepted on behalf of {{sellerCompanyName}}:</w:t></w:r></w:p>
-<w:p><w:r><w:t></w:t></w:r></w:p>
-<w:p><w:r><w:t>Signed: ___________________________</w:t></w:r></w:p>
-<w:p><w:r><w:t>Name: ___________________________</w:t></w:r></w:p>
-<w:p><w:r><w:t>Date: ___________________________</w:t></w:r></w:p>
-<w:p><w:r><w:t></w:t></w:r></w:p>
-<w:sectPr/>
-</w:body>
+  <w:body>
+    <w:p>
+      <w:r>
+        <w:rPr>
+          <w:b/>
+        </w:rPr>
+        <w:t>PRIVATE AND CONFIDENTIAL — SUBJECT TO CONTRACT</w:t>
+      </w:r>
+    </w:p>
+    <w:p>
+      <w:r>
+        <w:t/>
+      </w:r>
+    </w:p>
+    <w:p>
+      <w:r>
+        <w:t>{{sellerCompanyName}}</w:t>
+      </w:r>
+    </w:p>
+    <w:p>
+      <w:r>
+        <w:t>{{sellerAddress}}</w:t>
+      </w:r>
+    </w:p>
+    <w:p>
+      <w:r>
+        <w:t/>
+      </w:r>
+    </w:p>
+    <w:p>
+      <w:r>
+        <w:t>{{currentDate}}</w:t>
+      </w:r>
+    </w:p>
+    <w:p>
+      <w:r>
+        <w:t/>
+      </w:r>
+    </w:p>
+    <w:p>
+      <w:r>
+        <w:rPr>
+          <w:b/>
+        </w:rPr>
+        <w:t>HEADS OF TERMS — PROPOSED ACQUISITION OF {{sellerCompanyName}} ({{transactionTypeLabel}})</w:t>
+      </w:r>
+    </w:p>
+    <w:p>
+      <w:r>
+        <w:t/>
+      </w:r>
+    </w:p>
+    <w:p>
+      <w:r>
+        <w:t>Dear {{sellerContactName}},</w:t>
+      </w:r>
+    </w:p>
+    <w:p>
+      <w:r>
+        <w:t/>
+      </w:r>
+    </w:p>
+    <w:p>
+      <w:r>
+        <w:t>Further to our recent discussions, this letter sets out the principal terms upon which {{buyerCompanyName}} (the Buyer) is willing to acquire {{transactionDescription}} of {{sellerCompanyName}} (the Company). Save where expressly stated to be binding, this letter is non-binding and subject to contract.</w:t>
+      </w:r>
+    </w:p>
+    <w:p>
+      <w:r>
+        <w:t/>
+      </w:r>
+    </w:p>
+    <w:p>
+      <w:r>
+        <w:rPr>
+          <w:b/>
+        </w:rPr>
+        <w:t>1. PARTIES AND TRANSACTION OVERVIEW (Non-Binding)</w:t>
+      </w:r>
+    </w:p>
+    <w:p>
+      <w:r>
+        <w:t/>
+      </w:r>
+    </w:p>
+    <w:p>
+      <w:r>
+        <w:t>Buyer: {{buyerCompanyName}}</w:t>
+      </w:r>
+    </w:p>
+    <w:p>
+      <w:r>
+        <w:t>Seller: {{sellerContactName}}, {{sellerCompanyName}}</w:t>
+      </w:r>
+    </w:p>
+    <w:p>
+      <w:r>
+        <w:t>Transaction: Proposed {{transactionTypeLabel}} of {{sellerCompanyName}}</w:t>
+      </w:r>
+    </w:p>
+    <w:p>
+      <w:r>
+        <w:t/>
+      </w:r>
+    </w:p>
+    <w:p>
+      <w:r>
+        <w:rPr>
+          <w:b/>
+        </w:rPr>
+        <w:t>2. PRICE AND CONSIDERATION (Non-Binding)</w:t>
+      </w:r>
+    </w:p>
+    <w:p>
+      <w:r>
+        <w:t/>
+      </w:r>
+    </w:p>
+    <w:p>
+      <w:r>
+        <w:t>The total consideration for the acquisition is {{offerPrice}} (the Price), structured as follows:</w:t>
+      </w:r>
+    </w:p>
+    <w:p>
+      <w:r>
+        <w:t/>
+      </w:r>
+    </w:p>
+    <w:p>
+      <w:r>
+        <w:t>{{paymentText}}</w:t>
+      </w:r>
+    </w:p>
+    <w:p>
+      <w:r>
+        <w:t/>
+      </w:r>
+    </w:p>
+    <w:p>
+      <w:r>
+        <w:t>2.1 Cash at Completion: {{dayOnePayment}} payable to the Seller on the Completion Date.</w:t>
+      </w:r>
+    </w:p>
+    <w:p>
+      <w:r>
+        <w:t/>
+      </w:r>
+    </w:p>
+    <w:p>
+      <w:r>
+        <w:t>2.2 Deferred Consideration: {{deferredTotal}}{{deferredInstalment}}</w:t>
+      </w:r>
+    </w:p>
+    <w:p>
+      <w:r>
+        <w:t/>
+      </w:r>
+    </w:p>
+    <w:p>
+      <w:r>
+        <w:t>2.3 Earnout: {{earnoutMaximum}}{{earnoutMetric}}{{earnoutTermMonths}}</w:t>
+      </w:r>
+    </w:p>
+    <w:p>
+      <w:r>
+        <w:t/>
+      </w:r>
+    </w:p>
+    <w:p>
+      <w:r>
+        <w:rPr>
+          <w:b/>
+        </w:rPr>
+        <w:t>3. PRICE ASSUMPTIONS (Non-Binding)</w:t>
+      </w:r>
+    </w:p>
+    <w:p>
+      <w:r>
+        <w:t/>
+      </w:r>
+    </w:p>
+    <w:p>
+      <w:r>
+        <w:t>The Price is calculated on the following basis:</w:t>
+      </w:r>
+    </w:p>
+    <w:p>
+      <w:r>
+        <w:t/>
+      </w:r>
+    </w:p>
+    <w:p>
+      <w:r>
+        <w:t>{{breakdownText}}</w:t>
+      </w:r>
+    </w:p>
+    <w:p>
+      <w:r>
+        <w:t/>
+      </w:r>
+    </w:p>
+    <w:p>
+      <w:r>
+        <w:t>The Price is on a cash-free, debt-free basis, subject to a normalised level of working capital. Final Price will be adjusted through a completion accounts mechanism to reflect the actual cash, debt, and working capital position at the Completion Date.</w:t>
+      </w:r>
+    </w:p>
+    <w:p>
+      <w:r>
+        <w:t/>
+      </w:r>
+    </w:p>
+    <w:p>
+      <w:r>
+        <w:rPr>
+          <w:b/>
+        </w:rPr>
+        <w:t>4. CONDITIONS PRECEDENT (Non-Binding)</w:t>
+      </w:r>
+    </w:p>
+    <w:p>
+      <w:r>
+        <w:t/>
+      </w:r>
+    </w:p>
+    <w:p>
+      <w:r>
+        <w:t>The Proposed Acquisition is conditional upon:</w:t>
+      </w:r>
+    </w:p>
+    <w:p>
+      <w:r>
+        <w:t>(a) Satisfactory completion of legal and financial due diligence by the Buyer;</w:t>
+      </w:r>
+    </w:p>
+    <w:p>
+      <w:r>
+        <w:t>(b) Agreement and execution of a formal Sale and Purchase Agreement;</w:t>
+      </w:r>
+    </w:p>
+    <w:p>
+      <w:r>
+        <w:t>(c) Confirmation of funding arrangements satisfactory to the Buyer;</w:t>
+      </w:r>
+    </w:p>
+    <w:p>
+      <w:r>
+        <w:t>(d) No material adverse change in the business, assets, or financial position of the Company prior to Completion.</w:t>
+      </w:r>
+    </w:p>
+    <w:p>
+      <w:r>
+        <w:t/>
+      </w:r>
+    </w:p>
+    <w:p>
+      <w:r>
+        <w:t>{{additionalConditions}}</w:t>
+      </w:r>
+    </w:p>
+    <w:p>
+      <w:r>
+        <w:t/>
+      </w:r>
+    </w:p>
+    <w:p>
+      <w:r>
+        <w:rPr>
+          <w:b/>
+        </w:rPr>
+        <w:t>5. DUE DILIGENCE (Non-Binding)</w:t>
+      </w:r>
+    </w:p>
+    <w:p>
+      <w:r>
+        <w:t/>
+      </w:r>
+    </w:p>
+    <w:p>
+      <w:r>
+        <w:t>The Buyer will conduct legal, financial, tax, and commercial due diligence on the Company. The Seller agrees to provide, and procure that the Company provides, all reasonable access to information, personnel, and records as requested. Due diligence will be conducted on a confidential basis and subject to the NDA previously agreed between the parties.</w:t>
+      </w:r>
+    </w:p>
+    <w:p>
+      <w:r>
+        <w:t/>
+      </w:r>
+    </w:p>
+    <w:p>
+      <w:r>
+        <w:rPr>
+          <w:b/>
+        </w:rPr>
+        <w:t>6. TIMETABLE (Non-Binding)</w:t>
+      </w:r>
+    </w:p>
+    <w:p>
+      <w:r>
+        <w:t/>
+      </w:r>
+    </w:p>
+    <w:p>
+      <w:r>
+        <w:t>The parties will use reasonable endeavours to achieve completion of the Proposed Acquisition within {{targetCompletionWeeks}} weeks of the date of this letter, subject to satisfactory completion of due diligence and agreement of the Sale and Purchase Agreement.</w:t>
+      </w:r>
+    </w:p>
+    <w:p>
+      <w:r>
+        <w:t/>
+      </w:r>
+    </w:p>
+    <w:p>
+      <w:r>
+        <w:rPr>
+          <w:b/>
+        </w:rPr>
+        <w:t>7. EXCLUSIVITY (Binding)</w:t>
+      </w:r>
+    </w:p>
+    <w:p>
+      <w:r>
+        <w:t/>
+      </w:r>
+    </w:p>
+    <w:p>
+      <w:r>
+        <w:t>In consideration of the Buyer incurring costs in connection with the Proposed Acquisition, the Seller undertakes that for a period of {{exclusivityPeriodDays}} days from the date of this letter (the Exclusivity Period) the Seller shall not, and shall procure that neither the Company nor any agent acting on its behalf shall:</w:t>
+      </w:r>
+    </w:p>
+    <w:p>
+      <w:r>
+        <w:t>(a) solicit, encourage, or entertain any approach from any third party relating to the sale or disposal of the Company or its business or assets;</w:t>
+      </w:r>
+    </w:p>
+    <w:p>
+      <w:r>
+        <w:t>(b) enter into any negotiations or discussions with any third party in relation to such a transaction; or</w:t>
+      </w:r>
+    </w:p>
+    <w:p>
+      <w:r>
+        <w:t>(c) provide any information to any third party in connection with any such transaction.</w:t>
+      </w:r>
+    </w:p>
+    <w:p>
+      <w:r>
+        <w:t/>
+      </w:r>
+    </w:p>
+    <w:p>
+      <w:r>
+        <w:t>This clause 7 is binding on the parties.</w:t>
+      </w:r>
+    </w:p>
+    <w:p>
+      <w:r>
+        <w:t/>
+      </w:r>
+    </w:p>
+    <w:p>
+      <w:r>
+        <w:rPr>
+          <w:b/>
+        </w:rPr>
+        <w:t>8. NON-COMPETE AND NON-SOLICITATION (Non-Binding)</w:t>
+      </w:r>
+    </w:p>
+    <w:p>
+      <w:r>
+        <w:t/>
+      </w:r>
+    </w:p>
+    <w:p>
+      <w:r>
+        <w:t>It is intended that the Sale and Purchase Agreement will include undertakings by the Seller that for a period of {{nonCompetePeriodYears}} years following Completion, the Seller will not:</w:t>
+      </w:r>
+    </w:p>
+    <w:p>
+      <w:r>
+        <w:t>(a) carry on or be engaged or interested in any business which competes with the business of the Company as at Completion;</w:t>
+      </w:r>
+    </w:p>
+    <w:p>
+      <w:r>
+        <w:t>(b) solicit or entice away any employee, customer, or supplier of the Company for a period of {{nonSolicitPeriodYears}} years following Completion.</w:t>
+      </w:r>
+    </w:p>
+    <w:p>
+      <w:r>
+        <w:t/>
+      </w:r>
+    </w:p>
+    <w:p>
+      <w:r>
+        <w:rPr>
+          <w:b/>
+        </w:rPr>
+        <w:t>9. WARRANTIES AND INDEMNITIES (Non-Binding)</w:t>
+      </w:r>
+    </w:p>
+    <w:p>
+      <w:r>
+        <w:t/>
+      </w:r>
+    </w:p>
+    <w:p>
+      <w:r>
+        <w:t>The Sale and Purchase Agreement will include customary warranties from the Seller regarding the Company. It is intended that:</w:t>
+      </w:r>
+    </w:p>
+    <w:p>
+      <w:r>
+        <w:t>(a) Warranty claims must be notified within {{warrantyClaimPeriodMonths}} months of Completion;</w:t>
+      </w:r>
+    </w:p>
+    <w:p>
+      <w:r>
+        <w:t>(b) The minimum individual claim threshold is {{warrantyMinClaim}};</w:t>
+      </w:r>
+    </w:p>
+    <w:p>
+      <w:r>
+        <w:t>(c) The aggregate warranty cap will be agreed during the SPA negotiation.</w:t>
+      </w:r>
+    </w:p>
+    <w:p>
+      <w:r>
+        <w:t/>
+      </w:r>
+    </w:p>
+    <w:p>
+      <w:r>
+        <w:rPr>
+          <w:b/>
+        </w:rPr>
+        <w:t>10. SALE AND PURCHASE AGREEMENT (Non-Binding)</w:t>
+      </w:r>
+    </w:p>
+    <w:p>
+      <w:r>
+        <w:t/>
+      </w:r>
+    </w:p>
+    <w:p>
+      <w:r>
+        <w:t>The Proposed Acquisition will be documented by a formal Sale and Purchase Agreement to be prepared by the Buyer's solicitors. The SPA will be in a form customary for a transaction of this nature and will reflect the terms set out in this letter together with such other terms as are agreed between the parties during due diligence and negotiation.</w:t>
+      </w:r>
+    </w:p>
+    <w:p>
+      <w:r>
+        <w:t/>
+      </w:r>
+    </w:p>
+    <w:p>
+      <w:r>
+        <w:rPr>
+          <w:b/>
+        </w:rPr>
+        <w:t>11. EMPLOYEES (Non-Binding)</w:t>
+      </w:r>
+    </w:p>
+    <w:p>
+      <w:r>
+        <w:t/>
+      </w:r>
+    </w:p>
+    <w:p>
+      <w:r>
+        <w:t>The Buyer intends to retain all existing employees of the Company following Completion. The transaction will be subject to applicable employment legislation including TUPE where relevant. Key management arrangements will be discussed and agreed during the due diligence period.</w:t>
+      </w:r>
+    </w:p>
+    <w:p>
+      <w:r>
+        <w:t/>
+      </w:r>
+    </w:p>
+    <w:p>
+      <w:r>
+        <w:rPr>
+          <w:b/>
+        </w:rPr>
+        <w:t>12. COSTS (Binding)</w:t>
+      </w:r>
+    </w:p>
+    <w:p>
+      <w:r>
+        <w:t/>
+      </w:r>
+    </w:p>
+    <w:p>
+      <w:r>
+        <w:t>Each party shall bear their own legal and professional costs incurred in connection with the Proposed Acquisition, whether or not the transaction proceeds to Completion. This clause 12 is binding on the parties.</w:t>
+      </w:r>
+    </w:p>
+    <w:p>
+      <w:r>
+        <w:t/>
+      </w:r>
+    </w:p>
+    <w:p>
+      <w:r>
+        <w:rPr>
+          <w:b/>
+        </w:rPr>
+        <w:t>13. ANNOUNCEMENTS (Binding)</w:t>
+      </w:r>
+    </w:p>
+    <w:p>
+      <w:r>
+        <w:t/>
+      </w:r>
+    </w:p>
+    <w:p>
+      <w:r>
+        <w:t>Neither party shall make any public announcement or disclosure in connection with the Proposed Acquisition without the prior written consent of the other party, save as required by law or regulation. This clause 13 is binding on the parties.</w:t>
+      </w:r>
+    </w:p>
+    <w:p>
+      <w:r>
+        <w:t/>
+      </w:r>
+    </w:p>
+    <w:p>
+      <w:r>
+        <w:rPr>
+          <w:b/>
+        </w:rPr>
+        <w:t>14. GOVERNING LAW (Binding)</w:t>
+      </w:r>
+    </w:p>
+    <w:p>
+      <w:r>
+        <w:t/>
+      </w:r>
+    </w:p>
+    <w:p>
+      <w:r>
+        <w:t>This letter and any non-contractual obligations arising from or in connection with it shall be governed by and construed in accordance with the laws of England and Wales. The parties submit to the exclusive jurisdiction of the courts of England and Wales. This clause 14 is binding on the parties.</w:t>
+      </w:r>
+    </w:p>
+    <w:p>
+      <w:r>
+        <w:t/>
+      </w:r>
+    </w:p>
+    <w:p>
+      <w:r>
+        <w:t>Please confirm your agreement to the above terms by signing and returning a copy of this letter.</w:t>
+      </w:r>
+    </w:p>
+    <w:p>
+      <w:r>
+        <w:t/>
+      </w:r>
+    </w:p>
+    <w:p>
+      <w:r>
+        <w:t>Yours sincerely,</w:t>
+      </w:r>
+    </w:p>
+    <w:p>
+      <w:r>
+        <w:t/>
+      </w:r>
+    </w:p>
+    <w:p>
+      <w:r>
+        <w:t>{{buyerSignatoryName}}</w:t>
+      </w:r>
+    </w:p>
+    <w:p>
+      <w:r>
+        <w:t>{{buyerSignatoryTitle}}</w:t>
+      </w:r>
+    </w:p>
+    <w:p>
+      <w:r>
+        <w:t>{{buyerCompanyName}}</w:t>
+      </w:r>
+    </w:p>
+    <w:p>
+      <w:r>
+        <w:t/>
+      </w:r>
+    </w:p>
+    <w:p>
+      <w:r>
+        <w:t>Agreed and accepted on behalf of {{sellerCompanyName}}:</w:t>
+      </w:r>
+    </w:p>
+    <w:p>
+      <w:r>
+        <w:t/>
+      </w:r>
+    </w:p>
+    <w:p>
+      <w:r>
+        <w:t>Signed: ___________________________</w:t>
+      </w:r>
+    </w:p>
+    <w:p>
+      <w:r>
+        <w:t>Name: ___________________________</w:t>
+      </w:r>
+    </w:p>
+    <w:p>
+      <w:r>
+        <w:t>Date: ___________________________</w:t>
+      </w:r>
+    </w:p>
+    <w:p>
+      <w:r>
+        <w:t/>
+      </w:r>
+    </w:p>
+    <w:sectPr/>
+  </w:body>
 </w:document>
 </file>
 

</xml_diff>